<commit_message>
Sync memo form with updated master_fixed template
Template now has an editable closing line ({{จึงเรียนมาเพื่อ...}})
and a third signer block (ลงชื่อ3/ตำแหน่ง3), plus a dedicated
ตำแหน่ง2 instead of reusing ตำแหน่ง1. Form fields and JS payload
updated to match.

Co-Authored-By: Claude Sonnet 4.6 <noreply@anthropic.com>
</commit_message>
<xml_diff>
--- a/master_fixed.docx
+++ b/master_fixed.docx
@@ -411,6 +411,7 @@
       <w:pPr>
         <w:pStyle w:val="a3"/>
         <w:spacing w:before="240"/>
+        <w:ind w:firstLine="1418"/>
         <w:jc w:val="thaiDistribute"/>
         <w:rPr>
           <w:rStyle w:val="rse6dlih"/>
@@ -443,6 +444,7 @@
       <w:pPr>
         <w:pStyle w:val="a3"/>
         <w:spacing w:before="240"/>
+        <w:ind w:firstLine="1418"/>
         <w:jc w:val="thaiDistribute"/>
         <w:rPr>
           <w:rFonts w:ascii="DB ChuanPim PSU Light" w:hAnsi="DB ChuanPim PSU Light" w:cs="DB ChuanPim PSU Light"/>
@@ -472,6 +474,7 @@
       <w:pPr>
         <w:pStyle w:val="a3"/>
         <w:spacing w:before="240"/>
+        <w:ind w:firstLine="1418"/>
         <w:jc w:val="thaiDistribute"/>
         <w:rPr>
           <w:rFonts w:ascii="DB ChuanPim PSU Light" w:hAnsi="DB ChuanPim PSU Light" w:cs="DB ChuanPim PSU Light"/>
@@ -510,21 +513,55 @@
     </w:p>
     <w:p>
       <w:pPr>
-        <w:ind w:left="360" w:firstLine="720"/>
-        <w:rPr>
-          <w:rFonts w:ascii="DB ChuanPim PSU Light" w:hAnsi="DB ChuanPim PSU Light" w:cs="DB ChuanPim PSU Light"/>
-          <w:sz w:val="32"/>
-          <w:szCs w:val="32"/>
-        </w:rPr>
-      </w:pPr>
-      <w:r>
-        <w:rPr>
-          <w:rFonts w:ascii="DB ChuanPim PSU Light" w:hAnsi="DB ChuanPim PSU Light" w:cs="DB ChuanPim PSU Light"/>
-          <w:sz w:val="32"/>
-          <w:szCs w:val="32"/>
-          <w:cs/>
-        </w:rPr>
-        <w:t xml:space="preserve">จึงเรียนมาเพื่อโปรดพิจารณาอนุมัติ </w:t>
+        <w:ind w:left="360" w:firstLine="1058"/>
+        <w:rPr>
+          <w:rFonts w:ascii="DB ChuanPim PSU Light" w:hAnsi="DB ChuanPim PSU Light" w:cs="DB ChuanPim PSU Light"/>
+          <w:sz w:val="32"/>
+          <w:szCs w:val="32"/>
+        </w:rPr>
+      </w:pPr>
+      <w:r>
+        <w:rPr>
+          <w:rFonts w:ascii="DB ChuanPim PSU Light" w:hAnsi="DB ChuanPim PSU Light" w:cs="DB ChuanPim PSU Light"/>
+          <w:sz w:val="32"/>
+          <w:szCs w:val="32"/>
+        </w:rPr>
+        <w:t>{{</w:t>
+      </w:r>
+      <w:r>
+        <w:rPr>
+          <w:rFonts w:ascii="DB ChuanPim PSU Light" w:hAnsi="DB ChuanPim PSU Light" w:cs="DB ChuanPim PSU Light"/>
+          <w:sz w:val="32"/>
+          <w:szCs w:val="32"/>
+          <w:cs/>
+        </w:rPr>
+        <w:t>จึงเรียนมาเพื่อ</w:t>
+      </w:r>
+      <w:r>
+        <w:rPr>
+          <w:rFonts w:ascii="DB ChuanPim PSU Light" w:hAnsi="DB ChuanPim PSU Light" w:cs="DB ChuanPim PSU Light" w:hint="cs"/>
+          <w:sz w:val="32"/>
+          <w:szCs w:val="32"/>
+          <w:cs/>
+        </w:rPr>
+        <w:t>...</w:t>
+      </w:r>
+      <w:r>
+        <w:rPr>
+          <w:rFonts w:ascii="DB ChuanPim PSU Light" w:hAnsi="DB ChuanPim PSU Light" w:cs="DB ChuanPim PSU Light"/>
+          <w:sz w:val="32"/>
+          <w:szCs w:val="32"/>
+        </w:rPr>
+        <w:t>}}</w:t>
+      </w:r>
+      <w:r>
+        <w:rPr>
+          <w:rFonts w:ascii="DB ChuanPim PSU Light" w:hAnsi="DB ChuanPim PSU Light" w:cs="DB ChuanPim PSU Light"/>
+          <w:sz w:val="32"/>
+          <w:szCs w:val="32"/>
+          <w:cs/>
+        </w:rPr>
+        <w:t xml:space="preserve"> </w:t>
       </w:r>
     </w:p>
     <w:p>
@@ -562,20 +599,65 @@
           <w:szCs w:val="32"/>
         </w:rPr>
         <w:t xml:space="preserve">    </w:t>
-        <w:tab/>
-        <w:tab/>
-        <w:tab/>
-      </w:r>
-      <w:r>
-        <w:rPr>
-          <w:rFonts w:ascii="DB ChuanPim PSU Light" w:hAnsi="DB ChuanPim PSU Light" w:cs="DB ChuanPim PSU Light"/>
-          <w:sz w:val="32"/>
-          <w:szCs w:val="32"/>
-          <w:cs/>
-        </w:rPr>
-        <w:tab/>
-        <w:tab/>
-        <w:tab/>
+      </w:r>
+      <w:r>
+        <w:rPr>
+          <w:rFonts w:ascii="DB ChuanPim PSU Light" w:hAnsi="DB ChuanPim PSU Light" w:cs="DB ChuanPim PSU Light"/>
+          <w:sz w:val="32"/>
+          <w:szCs w:val="32"/>
+        </w:rPr>
+        <w:tab/>
+      </w:r>
+      <w:r>
+        <w:rPr>
+          <w:rFonts w:ascii="DB ChuanPim PSU Light" w:hAnsi="DB ChuanPim PSU Light" w:cs="DB ChuanPim PSU Light"/>
+          <w:sz w:val="32"/>
+          <w:szCs w:val="32"/>
+        </w:rPr>
+        <w:tab/>
+      </w:r>
+      <w:r>
+        <w:rPr>
+          <w:rFonts w:ascii="DB ChuanPim PSU Light" w:hAnsi="DB ChuanPim PSU Light" w:cs="DB ChuanPim PSU Light"/>
+          <w:sz w:val="32"/>
+          <w:szCs w:val="32"/>
+        </w:rPr>
+        <w:tab/>
+      </w:r>
+      <w:r>
+        <w:rPr>
+          <w:rFonts w:ascii="DB ChuanPim PSU Light" w:hAnsi="DB ChuanPim PSU Light" w:cs="DB ChuanPim PSU Light"/>
+          <w:sz w:val="32"/>
+          <w:szCs w:val="32"/>
+          <w:cs/>
+        </w:rPr>
+        <w:tab/>
+      </w:r>
+      <w:r>
+        <w:rPr>
+          <w:rFonts w:ascii="DB ChuanPim PSU Light" w:hAnsi="DB ChuanPim PSU Light" w:cs="DB ChuanPim PSU Light"/>
+          <w:sz w:val="32"/>
+          <w:szCs w:val="32"/>
+          <w:cs/>
+        </w:rPr>
+        <w:tab/>
+      </w:r>
+      <w:r>
+        <w:rPr>
+          <w:rFonts w:ascii="DB ChuanPim PSU Light" w:hAnsi="DB ChuanPim PSU Light" w:cs="DB ChuanPim PSU Light"/>
+          <w:sz w:val="32"/>
+          <w:szCs w:val="32"/>
+          <w:cs/>
+        </w:rPr>
+        <w:tab/>
+      </w:r>
+      <w:r>
+        <w:rPr>
+          <w:rFonts w:ascii="DB ChuanPim PSU Light" w:hAnsi="DB ChuanPim PSU Light" w:cs="DB ChuanPim PSU Light"/>
+          <w:sz w:val="32"/>
+          <w:szCs w:val="32"/>
+          <w:cs/>
+        </w:rPr>
         <w:tab/>
         <w:t>(</w:t>
       </w:r>
@@ -620,12 +702,61 @@
           <w:szCs w:val="32"/>
         </w:rPr>
         <w:tab/>
-        <w:tab/>
-        <w:tab/>
-        <w:tab/>
-        <w:tab/>
-        <w:tab/>
-        <w:tab/>
+      </w:r>
+      <w:r>
+        <w:rPr>
+          <w:rFonts w:ascii="DB ChuanPim PSU Light" w:hAnsi="DB ChuanPim PSU Light" w:cs="DB ChuanPim PSU Light"/>
+          <w:sz w:val="32"/>
+          <w:szCs w:val="32"/>
+        </w:rPr>
+        <w:tab/>
+      </w:r>
+      <w:r>
+        <w:rPr>
+          <w:rFonts w:ascii="DB ChuanPim PSU Light" w:hAnsi="DB ChuanPim PSU Light" w:cs="DB ChuanPim PSU Light"/>
+          <w:sz w:val="32"/>
+          <w:szCs w:val="32"/>
+        </w:rPr>
+        <w:tab/>
+      </w:r>
+      <w:r>
+        <w:rPr>
+          <w:rFonts w:ascii="DB ChuanPim PSU Light" w:hAnsi="DB ChuanPim PSU Light" w:cs="DB ChuanPim PSU Light"/>
+          <w:sz w:val="32"/>
+          <w:szCs w:val="32"/>
+        </w:rPr>
+        <w:tab/>
+      </w:r>
+      <w:r>
+        <w:rPr>
+          <w:rFonts w:ascii="DB ChuanPim PSU Light" w:hAnsi="DB ChuanPim PSU Light" w:cs="DB ChuanPim PSU Light"/>
+          <w:sz w:val="32"/>
+          <w:szCs w:val="32"/>
+        </w:rPr>
+        <w:tab/>
+      </w:r>
+      <w:r>
+        <w:rPr>
+          <w:rFonts w:ascii="DB ChuanPim PSU Light" w:hAnsi="DB ChuanPim PSU Light" w:cs="DB ChuanPim PSU Light"/>
+          <w:sz w:val="32"/>
+          <w:szCs w:val="32"/>
+        </w:rPr>
+        <w:tab/>
+      </w:r>
+      <w:r>
+        <w:rPr>
+          <w:rFonts w:ascii="DB ChuanPim PSU Light" w:hAnsi="DB ChuanPim PSU Light" w:cs="DB ChuanPim PSU Light"/>
+          <w:sz w:val="32"/>
+          <w:szCs w:val="32"/>
+        </w:rPr>
+        <w:tab/>
+      </w:r>
+      <w:r>
+        <w:rPr>
+          <w:rFonts w:ascii="DB ChuanPim PSU Light" w:hAnsi="DB ChuanPim PSU Light" w:cs="DB ChuanPim PSU Light"/>
+          <w:sz w:val="32"/>
+          <w:szCs w:val="32"/>
+        </w:rPr>
         <w:tab/>
       </w:r>
       <w:r>
@@ -688,9 +819,41 @@
           <w:cs/>
         </w:rPr>
         <w:tab/>
-        <w:tab/>
-        <w:tab/>
-        <w:tab/>
+      </w:r>
+      <w:r>
+        <w:rPr>
+          <w:rFonts w:ascii="DB ChuanPim PSU Light" w:hAnsi="DB ChuanPim PSU Light" w:cs="DB ChuanPim PSU Light"/>
+          <w:sz w:val="32"/>
+          <w:szCs w:val="32"/>
+          <w:cs/>
+        </w:rPr>
+        <w:tab/>
+      </w:r>
+      <w:r>
+        <w:rPr>
+          <w:rFonts w:ascii="DB ChuanPim PSU Light" w:hAnsi="DB ChuanPim PSU Light" w:cs="DB ChuanPim PSU Light"/>
+          <w:sz w:val="32"/>
+          <w:szCs w:val="32"/>
+          <w:cs/>
+        </w:rPr>
+        <w:tab/>
+      </w:r>
+      <w:r>
+        <w:rPr>
+          <w:rFonts w:ascii="DB ChuanPim PSU Light" w:hAnsi="DB ChuanPim PSU Light" w:cs="DB ChuanPim PSU Light"/>
+          <w:sz w:val="32"/>
+          <w:szCs w:val="32"/>
+          <w:cs/>
+        </w:rPr>
+        <w:tab/>
+      </w:r>
+      <w:r>
+        <w:rPr>
+          <w:rFonts w:ascii="DB ChuanPim PSU Light" w:hAnsi="DB ChuanPim PSU Light" w:cs="DB ChuanPim PSU Light"/>
+          <w:sz w:val="32"/>
+          <w:szCs w:val="32"/>
+          <w:cs/>
+        </w:rPr>
         <w:tab/>
       </w:r>
       <w:r>
@@ -838,7 +1001,15 @@
           <w:sz w:val="32"/>
           <w:szCs w:val="32"/>
         </w:rPr>
-        <w:t>1}}</w:t>
+        <w:t>2</w:t>
+      </w:r>
+      <w:r>
+        <w:rPr>
+          <w:rFonts w:ascii="DB ChuanPim PSU Light" w:hAnsi="DB ChuanPim PSU Light" w:cs="DB ChuanPim PSU Light"/>
+          <w:sz w:val="32"/>
+          <w:szCs w:val="32"/>
+        </w:rPr>
+        <w:t>}}</w:t>
       </w:r>
       <w:r>
         <w:rPr>
@@ -860,10 +1031,35 @@
           <w:rFonts w:ascii="DB ChuanPim PSU Light" w:hAnsi="DB ChuanPim PSU Light" w:cs="DB ChuanPim PSU Light"/>
         </w:rPr>
         <w:t xml:space="preserve">     </w:t>
-        <w:tab/>
-        <w:tab/>
-        <w:tab/>
-        <w:tab/>
+      </w:r>
+      <w:r>
+        <w:rPr>
+          <w:rFonts w:ascii="DB ChuanPim PSU Light" w:hAnsi="DB ChuanPim PSU Light" w:cs="DB ChuanPim PSU Light"/>
+        </w:rPr>
+        <w:tab/>
+      </w:r>
+      <w:r>
+        <w:rPr>
+          <w:rFonts w:ascii="DB ChuanPim PSU Light" w:hAnsi="DB ChuanPim PSU Light" w:cs="DB ChuanPim PSU Light"/>
+        </w:rPr>
+        <w:tab/>
+      </w:r>
+      <w:r>
+        <w:rPr>
+          <w:rFonts w:ascii="DB ChuanPim PSU Light" w:hAnsi="DB ChuanPim PSU Light" w:cs="DB ChuanPim PSU Light"/>
+        </w:rPr>
+        <w:tab/>
+      </w:r>
+      <w:r>
+        <w:rPr>
+          <w:rFonts w:ascii="DB ChuanPim PSU Light" w:hAnsi="DB ChuanPim PSU Light" w:cs="DB ChuanPim PSU Light"/>
+        </w:rPr>
+        <w:tab/>
+      </w:r>
+      <w:r>
+        <w:rPr>
+          <w:rFonts w:ascii="DB ChuanPim PSU Light" w:hAnsi="DB ChuanPim PSU Light" w:cs="DB ChuanPim PSU Light"/>
+        </w:rPr>
         <w:tab/>
         <w:t xml:space="preserve">      ……..……/……..……/…………..</w:t>
       </w:r>
@@ -876,6 +1072,186 @@
           <w:szCs w:val="30"/>
         </w:rPr>
       </w:pPr>
+    </w:p>
+    <w:p>
+      <w:pPr>
+        <w:ind w:left="3600" w:firstLine="720"/>
+        <w:rPr>
+          <w:rFonts w:ascii="DB ChuanPim PSU Light" w:hAnsi="DB ChuanPim PSU Light" w:cs="DB ChuanPim PSU Light"/>
+          <w:sz w:val="30"/>
+          <w:szCs w:val="30"/>
+        </w:rPr>
+      </w:pPr>
+    </w:p>
+    <w:p>
+      <w:pPr>
+        <w:ind w:left="4320"/>
+        <w:rPr>
+          <w:rFonts w:ascii="DB ChuanPim PSU Light" w:hAnsi="DB ChuanPim PSU Light" w:cs="DB ChuanPim PSU Light"/>
+          <w:sz w:val="32"/>
+          <w:szCs w:val="32"/>
+        </w:rPr>
+      </w:pPr>
+      <w:r>
+        <w:rPr>
+          <w:rFonts w:ascii="DB ChuanPim PSU Light" w:hAnsi="DB ChuanPim PSU Light" w:cs="DB ChuanPim PSU Light"/>
+          <w:sz w:val="32"/>
+          <w:szCs w:val="32"/>
+        </w:rPr>
+        <w:t xml:space="preserve">         </w:t>
+      </w:r>
+      <w:r>
+        <w:rPr>
+          <w:rFonts w:ascii="DB ChuanPim PSU Light" w:hAnsi="DB ChuanPim PSU Light" w:cs="DB ChuanPim PSU Light"/>
+          <w:sz w:val="32"/>
+          <w:szCs w:val="32"/>
+          <w:cs/>
+        </w:rPr>
+        <w:t>(</w:t>
+      </w:r>
+      <w:r>
+        <w:rPr>
+          <w:rFonts w:ascii="DB ChuanPim PSU Light" w:hAnsi="DB ChuanPim PSU Light" w:cs="DB ChuanPim PSU Light"/>
+          <w:sz w:val="32"/>
+          <w:szCs w:val="32"/>
+        </w:rPr>
+        <w:t>{{</w:t>
+      </w:r>
+      <w:r>
+        <w:rPr>
+          <w:rFonts w:ascii="DB ChuanPim PSU Light" w:hAnsi="DB ChuanPim PSU Light" w:cs="DB ChuanPim PSU Light" w:hint="cs"/>
+          <w:sz w:val="32"/>
+          <w:szCs w:val="32"/>
+          <w:cs/>
+        </w:rPr>
+        <w:t>ลงชื่อ</w:t>
+      </w:r>
+      <w:r>
+        <w:rPr>
+          <w:rFonts w:ascii="DB ChuanPim PSU Light" w:hAnsi="DB ChuanPim PSU Light" w:cs="DB ChuanPim PSU Light"/>
+          <w:sz w:val="32"/>
+          <w:szCs w:val="32"/>
+        </w:rPr>
+        <w:t>3</w:t>
+      </w:r>
+      <w:r>
+        <w:rPr>
+          <w:rFonts w:ascii="DB ChuanPim PSU Light" w:hAnsi="DB ChuanPim PSU Light" w:cs="DB ChuanPim PSU Light"/>
+          <w:sz w:val="32"/>
+          <w:szCs w:val="32"/>
+        </w:rPr>
+        <w:t>}}</w:t>
+      </w:r>
+      <w:r>
+        <w:rPr>
+          <w:rFonts w:ascii="DB ChuanPim PSU Light" w:hAnsi="DB ChuanPim PSU Light" w:cs="DB ChuanPim PSU Light"/>
+          <w:sz w:val="32"/>
+          <w:szCs w:val="32"/>
+          <w:cs/>
+        </w:rPr>
+        <w:t>)</w:t>
+      </w:r>
+      <w:r>
+        <w:rPr>
+          <w:rFonts w:ascii="DB ChuanPim PSU Light" w:hAnsi="DB ChuanPim PSU Light" w:cs="DB ChuanPim PSU Light"/>
+          <w:sz w:val="32"/>
+          <w:szCs w:val="32"/>
+        </w:rPr>
+        <w:tab/>
+      </w:r>
+    </w:p>
+    <w:p>
+      <w:pPr>
+        <w:ind w:left="3600" w:firstLine="720"/>
+        <w:rPr>
+          <w:rFonts w:ascii="DB ChuanPim PSU Light" w:hAnsi="DB ChuanPim PSU Light" w:cs="DB ChuanPim PSU Light"/>
+        </w:rPr>
+      </w:pPr>
+      <w:r>
+        <w:rPr>
+          <w:rFonts w:ascii="DB ChuanPim PSU Light" w:hAnsi="DB ChuanPim PSU Light" w:cs="DB ChuanPim PSU Light"/>
+          <w:sz w:val="32"/>
+          <w:szCs w:val="32"/>
+        </w:rPr>
+        <w:t xml:space="preserve">        {{</w:t>
+      </w:r>
+      <w:r>
+        <w:rPr>
+          <w:rFonts w:ascii="DB ChuanPim PSU Light" w:hAnsi="DB ChuanPim PSU Light" w:cs="DB ChuanPim PSU Light" w:hint="cs"/>
+          <w:sz w:val="32"/>
+          <w:szCs w:val="32"/>
+          <w:cs/>
+        </w:rPr>
+        <w:t>ตำแหน่ง</w:t>
+      </w:r>
+      <w:r>
+        <w:rPr>
+          <w:rFonts w:ascii="DB ChuanPim PSU Light" w:hAnsi="DB ChuanPim PSU Light" w:cs="DB ChuanPim PSU Light"/>
+          <w:sz w:val="32"/>
+          <w:szCs w:val="32"/>
+        </w:rPr>
+        <w:t>3</w:t>
+      </w:r>
+      <w:r>
+        <w:rPr>
+          <w:rFonts w:ascii="DB ChuanPim PSU Light" w:hAnsi="DB ChuanPim PSU Light" w:cs="DB ChuanPim PSU Light"/>
+          <w:sz w:val="32"/>
+          <w:szCs w:val="32"/>
+        </w:rPr>
+        <w:t>}}</w:t>
+      </w:r>
+      <w:r>
+        <w:rPr>
+          <w:rFonts w:ascii="DB ChuanPim PSU Light" w:hAnsi="DB ChuanPim PSU Light" w:cs="DB ChuanPim PSU Light"/>
+        </w:rPr>
+        <w:t xml:space="preserve">           </w:t>
+      </w:r>
+    </w:p>
+    <w:p>
+      <w:pPr>
+        <w:rPr>
+          <w:rFonts w:ascii="DB ChuanPim PSU Light" w:hAnsi="DB ChuanPim PSU Light" w:cs="DB ChuanPim PSU Light"/>
+          <w:sz w:val="30"/>
+          <w:szCs w:val="30"/>
+        </w:rPr>
+      </w:pPr>
+      <w:r>
+        <w:rPr>
+          <w:rFonts w:ascii="DB ChuanPim PSU Light" w:hAnsi="DB ChuanPim PSU Light" w:cs="DB ChuanPim PSU Light"/>
+        </w:rPr>
+        <w:t xml:space="preserve">     </w:t>
+      </w:r>
+      <w:r>
+        <w:rPr>
+          <w:rFonts w:ascii="DB ChuanPim PSU Light" w:hAnsi="DB ChuanPim PSU Light" w:cs="DB ChuanPim PSU Light"/>
+        </w:rPr>
+        <w:tab/>
+      </w:r>
+      <w:r>
+        <w:rPr>
+          <w:rFonts w:ascii="DB ChuanPim PSU Light" w:hAnsi="DB ChuanPim PSU Light" w:cs="DB ChuanPim PSU Light"/>
+        </w:rPr>
+        <w:tab/>
+      </w:r>
+      <w:r>
+        <w:rPr>
+          <w:rFonts w:ascii="DB ChuanPim PSU Light" w:hAnsi="DB ChuanPim PSU Light" w:cs="DB ChuanPim PSU Light"/>
+        </w:rPr>
+        <w:tab/>
+      </w:r>
+      <w:r>
+        <w:rPr>
+          <w:rFonts w:ascii="DB ChuanPim PSU Light" w:hAnsi="DB ChuanPim PSU Light" w:cs="DB ChuanPim PSU Light"/>
+        </w:rPr>
+        <w:tab/>
+      </w:r>
+      <w:r>
+        <w:rPr>
+          <w:rFonts w:ascii="DB ChuanPim PSU Light" w:hAnsi="DB ChuanPim PSU Light" w:cs="DB ChuanPim PSU Light"/>
+        </w:rPr>
+        <w:tab/>
+        <w:t xml:space="preserve">      ……..……/……..……/…………..</w:t>
+      </w:r>
     </w:p>
     <w:p>
       <w:pPr>
@@ -914,10 +1290,50 @@
           <w:cs/>
         </w:rPr>
         <w:tab/>
-        <w:tab/>
-        <w:tab/>
-        <w:tab/>
-        <w:tab/>
+      </w:r>
+      <w:r>
+        <w:rPr>
+          <w:rFonts w:ascii="TH SarabunPSK" w:hAnsi="TH SarabunPSK" w:cs="TH SarabunPSK"/>
+          <w:sz w:val="30"/>
+          <w:szCs w:val="30"/>
+          <w:cs/>
+        </w:rPr>
+        <w:tab/>
+      </w:r>
+      <w:r>
+        <w:rPr>
+          <w:rFonts w:ascii="TH SarabunPSK" w:hAnsi="TH SarabunPSK" w:cs="TH SarabunPSK"/>
+          <w:sz w:val="30"/>
+          <w:szCs w:val="30"/>
+          <w:cs/>
+        </w:rPr>
+        <w:tab/>
+      </w:r>
+      <w:r>
+        <w:rPr>
+          <w:rFonts w:ascii="TH SarabunPSK" w:hAnsi="TH SarabunPSK" w:cs="TH SarabunPSK"/>
+          <w:sz w:val="30"/>
+          <w:szCs w:val="30"/>
+          <w:cs/>
+        </w:rPr>
+        <w:tab/>
+      </w:r>
+      <w:r>
+        <w:rPr>
+          <w:rFonts w:ascii="TH SarabunPSK" w:hAnsi="TH SarabunPSK" w:cs="TH SarabunPSK"/>
+          <w:sz w:val="30"/>
+          <w:szCs w:val="30"/>
+          <w:cs/>
+        </w:rPr>
+        <w:tab/>
+      </w:r>
+      <w:r>
+        <w:rPr>
+          <w:rFonts w:ascii="TH SarabunPSK" w:hAnsi="TH SarabunPSK" w:cs="TH SarabunPSK"/>
+          <w:sz w:val="30"/>
+          <w:szCs w:val="30"/>
+          <w:cs/>
+        </w:rPr>
         <w:tab/>
       </w:r>
       <w:r>

</xml_diff>

<commit_message>
fix: replace master_fixed.docx header with layout from ตย บันทึกข้อความ
- Copy header section (paras 0-7) from example file: floating logo box,
  PSU logo PNG, ส่วนราชการ/ที่/วันที่ row, เรื่อง row, horizontal rule,
  เรียน row — same layout/fonts as the reference document.
- Replace hard-coded values in header with template placeholders
  ({{ฝ่าย}}, {{เลขที่}}, {{วันที่}}, {{เรื่อง}}, {{เรียน}}).
- Swap logo image from JPEG (11KB) to the higher-quality PNG from example.
- Keep body placeholders (ภาคเหตุ, signers, etc.) from original template.
- Retain correct page margins (top/bottom 1.5cm, left 3cm, right 2cm).

Co-Authored-By: Claude Sonnet 4.6 <noreply@anthropic.com>
</commit_message>
<xml_diff>
--- a/master_fixed.docx
+++ b/master_fixed.docx
@@ -1,1361 +1,6 @@
 
-<file path=word/document.xml><?xml version="1.0" encoding="utf-8"?>
-<w:document xmlns:wpc="http://schemas.microsoft.com/office/word/2010/wordprocessingCanvas" xmlns:cx="http://schemas.microsoft.com/office/drawing/2014/chartex" xmlns:cx1="http://schemas.microsoft.com/office/drawing/2015/9/8/chartex" xmlns:cx2="http://schemas.microsoft.com/office/drawing/2015/10/21/chartex" xmlns:cx3="http://schemas.microsoft.com/office/drawing/2016/5/9/chartex" xmlns:cx4="http://schemas.microsoft.com/office/drawing/2016/5/10/chartex" xmlns:cx5="http://schemas.microsoft.com/office/drawing/2016/5/11/chartex" xmlns:cx6="http://schemas.microsoft.com/office/drawing/2016/5/12/chartex" xmlns:cx7="http://schemas.microsoft.com/office/drawing/2016/5/13/chartex" xmlns:cx8="http://schemas.microsoft.com/office/drawing/2016/5/14/chartex" xmlns:mc="http://schemas.openxmlformats.org/markup-compatibility/2006" xmlns:aink="http://schemas.microsoft.com/office/drawing/2016/ink" xmlns:am3d="http://schemas.microsoft.com/office/drawing/2017/model3d" xmlns:o="urn:schemas-microsoft-com:office:office" xmlns:oel="http://schemas.microsoft.com/office/2019/extlst" xmlns:r="http://schemas.openxmlformats.org/officeDocument/2006/relationships" xmlns:m="http://schemas.openxmlformats.org/officeDocument/2006/math" xmlns:v="urn:schemas-microsoft-com:vml" xmlns:wp14="http://schemas.microsoft.com/office/word/2010/wordprocessingDrawing" xmlns:wp="http://schemas.openxmlformats.org/drawingml/2006/wordprocessingDrawing" xmlns:w10="urn:schemas-microsoft-com:office:word" xmlns:w="http://schemas.openxmlformats.org/wordprocessingml/2006/main" xmlns:w14="http://schemas.microsoft.com/office/word/2010/wordml" xmlns:w15="http://schemas.microsoft.com/office/word/2012/wordml" xmlns:w16cex="http://schemas.microsoft.com/office/word/2018/wordml/cex" xmlns:w16cid="http://schemas.microsoft.com/office/word/2016/wordml/cid" xmlns:w16="http://schemas.microsoft.com/office/word/2018/wordml" xmlns:w16du="http://schemas.microsoft.com/office/word/2023/wordml/word16du" xmlns:w16sdtdh="http://schemas.microsoft.com/office/word/2020/wordml/sdtdatahash" xmlns:w16sdtfl="http://schemas.microsoft.com/office/word/2024/wordml/sdtformatlock" xmlns:w16se="http://schemas.microsoft.com/office/word/2015/wordml/symex" xmlns:wpg="http://schemas.microsoft.com/office/word/2010/wordprocessingGroup" xmlns:wpi="http://schemas.microsoft.com/office/word/2010/wordprocessingInk" xmlns:wne="http://schemas.microsoft.com/office/word/2006/wordml" xmlns:wps="http://schemas.microsoft.com/office/word/2010/wordprocessingShape" mc:Ignorable="w14 w15 w16se w16cid w16 w16cex w16sdtdh w16sdtfl w16du wp14">
-  <w:body>
-    <w:p>
-      <w:pPr>
-        <w:ind w:left="2880" w:firstLine="720"/>
-        <w:rPr>
-          <w:rFonts w:ascii="DB ChuanPim PSU Light" w:hAnsi="DB ChuanPim PSU Light" w:cs="DB ChuanPim PSU Light"/>
-          <w:b/>
-          <w:bCs/>
-          <w:sz w:val="48"/>
-          <w:szCs w:val="48"/>
-        </w:rPr>
-      </w:pPr>
-      <w:r>
-        <w:rPr>
-          <w:rFonts w:ascii="DB ChuanPim PSU Light" w:hAnsi="DB ChuanPim PSU Light" w:cs="DB ChuanPim PSU Light"/>
-          <w:b/>
-          <w:bCs/>
-          <w:noProof/>
-        </w:rPr>
-        <w:drawing>
-          <wp:anchor distT="0" distB="0" distL="114300" distR="114300" simplePos="0" relativeHeight="251664384" behindDoc="0" locked="0" layoutInCell="1" allowOverlap="1" wp14:anchorId="510CDE08" wp14:editId="09949342">
-            <wp:simplePos x="0" y="0"/>
-            <wp:positionH relativeFrom="margin">
-              <wp:posOffset>75565</wp:posOffset>
-            </wp:positionH>
-            <wp:positionV relativeFrom="margin">
-              <wp:posOffset>-326390</wp:posOffset>
-            </wp:positionV>
-            <wp:extent cx="670560" cy="670560"/>
-            <wp:effectExtent l="0" t="0" r="0" b="0"/>
-            <wp:wrapSquare wrapText="bothSides"/>
-            <wp:docPr id="22" name="รูปภาพ 22" descr="คำอธิบาย: อันนี้"/>
-            <wp:cNvGraphicFramePr>
-              <a:graphicFrameLocks xmlns:a="http://schemas.openxmlformats.org/drawingml/2006/main" noChangeAspect="1"/>
-            </wp:cNvGraphicFramePr>
-            <a:graphic xmlns:a="http://schemas.openxmlformats.org/drawingml/2006/main">
-              <a:graphicData uri="http://schemas.openxmlformats.org/drawingml/2006/picture">
-                <pic:pic xmlns:pic="http://schemas.openxmlformats.org/drawingml/2006/picture">
-                  <pic:nvPicPr>
-                    <pic:cNvPr id="0" name="รูปภาพ 1" descr="คำอธิบาย: อันนี้"/>
-                    <pic:cNvPicPr>
-                      <a:picLocks noChangeAspect="1" noChangeArrowheads="1"/>
-                    </pic:cNvPicPr>
-                  </pic:nvPicPr>
-                  <pic:blipFill>
-                    <a:blip r:embed="rId8" cstate="print">
-                      <a:extLst>
-                        <a:ext uri="{28A0092B-C50C-407E-A947-70E740481C1C}">
-                          <a14:useLocalDpi xmlns:a14="http://schemas.microsoft.com/office/drawing/2010/main" val="0"/>
-                        </a:ext>
-                      </a:extLst>
-                    </a:blip>
-                    <a:srcRect r="12593" b="19215"/>
-                    <a:stretch>
-                      <a:fillRect/>
-                    </a:stretch>
-                  </pic:blipFill>
-                  <pic:spPr bwMode="auto">
-                    <a:xfrm>
-                      <a:off x="0" y="0"/>
-                      <a:ext cx="670560" cy="670560"/>
-                    </a:xfrm>
-                    <a:prstGeom prst="rect">
-                      <a:avLst/>
-                    </a:prstGeom>
-                    <a:noFill/>
-                    <a:ln>
-                      <a:noFill/>
-                    </a:ln>
-                  </pic:spPr>
-                </pic:pic>
-              </a:graphicData>
-            </a:graphic>
-            <wp14:sizeRelH relativeFrom="margin">
-              <wp14:pctWidth>0</wp14:pctWidth>
-            </wp14:sizeRelH>
-            <wp14:sizeRelV relativeFrom="margin">
-              <wp14:pctHeight>0</wp14:pctHeight>
-            </wp14:sizeRelV>
-          </wp:anchor>
-        </w:drawing>
-      </w:r>
-      <w:r>
-        <w:rPr>
-          <w:rFonts w:ascii="DB ChuanPim PSU Light" w:hAnsi="DB ChuanPim PSU Light" w:cs="DB ChuanPim PSU Light"/>
-          <w:b/>
-          <w:bCs/>
-          <w:sz w:val="48"/>
-          <w:szCs w:val="48"/>
-          <w:cs/>
-        </w:rPr>
-        <w:t>บันทึกข้อความ</w:t>
-      </w:r>
-    </w:p>
-    <w:p>
-      <w:pPr>
-        <w:tabs>
-          <w:tab w:val="left" w:pos="9000"/>
-        </w:tabs>
-        <w:rPr>
-          <w:rFonts w:ascii="DB ChuanPim PSU Light" w:hAnsi="DB ChuanPim PSU Light" w:cs="DB ChuanPim PSU Light"/>
-          <w:sz w:val="32"/>
-          <w:szCs w:val="32"/>
-          <w:cs/>
-        </w:rPr>
-      </w:pPr>
-      <w:bookmarkStart w:id="0" w:name="_Hlk196728154"/>
-      <w:r>
-        <w:rPr>
-          <w:rFonts w:ascii="DB ChuanPim PSU Light" w:hAnsi="DB ChuanPim PSU Light" w:cs="DB ChuanPim PSU Light"/>
-          <w:b/>
-          <w:bCs/>
-          <w:sz w:val="32"/>
-          <w:szCs w:val="32"/>
-          <w:cs/>
-        </w:rPr>
-        <w:t>ส่วนงาน</w:t>
-      </w:r>
-      <w:r>
-        <w:rPr>
-          <w:rFonts w:ascii="DB ChuanPim PSU Light" w:hAnsi="DB ChuanPim PSU Light" w:cs="DB ChuanPim PSU Light" w:hint="cs"/>
-          <w:b/>
-          <w:bCs/>
-          <w:sz w:val="32"/>
-          <w:szCs w:val="32"/>
-          <w:cs/>
-        </w:rPr>
-        <w:t>จัดการศึกษา</w:t>
-      </w:r>
-      <w:r>
-        <w:rPr>
-          <w:rFonts w:ascii="DB ChuanPim PSU Light" w:hAnsi="DB ChuanPim PSU Light" w:cs="DB ChuanPim PSU Light" w:hint="cs"/>
-          <w:sz w:val="32"/>
-          <w:szCs w:val="32"/>
-          <w:cs/>
-        </w:rPr>
-        <w:t xml:space="preserve"> </w:t>
-      </w:r>
-      <w:r>
-        <w:rPr>
-          <w:rFonts w:ascii="DB ChuanPim PSU Light" w:hAnsi="DB ChuanPim PSU Light" w:cs="DB ChuanPim PSU Light"/>
-          <w:sz w:val="32"/>
-          <w:szCs w:val="32"/>
-        </w:rPr>
-        <w:t>{{</w:t>
-      </w:r>
-      <w:r>
-        <w:rPr>
-          <w:rFonts w:ascii="DB ChuanPim PSU Light" w:hAnsi="DB ChuanPim PSU Light" w:cs="DB ChuanPim PSU Light" w:hint="cs"/>
-          <w:sz w:val="32"/>
-          <w:szCs w:val="32"/>
-          <w:cs/>
-        </w:rPr>
-        <w:t>ฝ่าย</w:t>
-      </w:r>
-      <w:r>
-        <w:rPr>
-          <w:rFonts w:ascii="DB ChuanPim PSU Light" w:hAnsi="DB ChuanPim PSU Light" w:cs="DB ChuanPim PSU Light"/>
-          <w:sz w:val="32"/>
-          <w:szCs w:val="32"/>
-        </w:rPr>
-        <w:t>}}</w:t>
-      </w:r>
-      <w:r>
-        <w:rPr>
-          <w:rFonts w:ascii="DB ChuanPim PSU Light" w:hAnsi="DB ChuanPim PSU Light" w:cs="DB ChuanPim PSU Light"/>
-          <w:color w:val="000000"/>
-          <w:sz w:val="32"/>
-          <w:szCs w:val="32"/>
-          <w:cs/>
-        </w:rPr>
-        <w:t xml:space="preserve"> </w:t>
-      </w:r>
-    </w:p>
-    <w:p>
-      <w:pPr>
-        <w:rPr>
-          <w:rFonts w:ascii="DB ChuanPim PSU Light" w:hAnsi="DB ChuanPim PSU Light" w:cs="DB ChuanPim PSU Light"/>
-          <w:sz w:val="32"/>
-          <w:szCs w:val="32"/>
-        </w:rPr>
-      </w:pPr>
-      <w:r>
-        <w:rPr>
-          <w:rFonts w:ascii="DB ChuanPim PSU Light" w:hAnsi="DB ChuanPim PSU Light" w:cs="DB ChuanPim PSU Light"/>
-          <w:b/>
-          <w:bCs/>
-          <w:sz w:val="32"/>
-          <w:szCs w:val="32"/>
-          <w:cs/>
-        </w:rPr>
-        <w:t xml:space="preserve">ที่ </w:t>
-      </w:r>
-      <w:r>
-        <w:rPr>
-          <w:rFonts w:ascii="DB ChuanPim PSU Light" w:hAnsi="DB ChuanPim PSU Light" w:cs="DB ChuanPim PSU Light"/>
-          <w:sz w:val="32"/>
-          <w:szCs w:val="32"/>
-          <w:cs/>
-        </w:rPr>
-        <w:t xml:space="preserve"> </w:t>
-      </w:r>
-      <w:r>
-        <w:rPr>
-          <w:rFonts w:ascii="DB ChuanPim PSU Light" w:hAnsi="DB ChuanPim PSU Light" w:cs="DB ChuanPim PSU Light"/>
-          <w:sz w:val="32"/>
-          <w:szCs w:val="32"/>
-        </w:rPr>
-        <w:t>{{</w:t>
-      </w:r>
-      <w:r>
-        <w:rPr>
-          <w:rFonts w:ascii="DB ChuanPim PSU Light" w:hAnsi="DB ChuanPim PSU Light" w:cs="DB ChuanPim PSU Light" w:hint="cs"/>
-          <w:sz w:val="32"/>
-          <w:szCs w:val="32"/>
-          <w:cs/>
-        </w:rPr>
-        <w:t>เลขที่</w:t>
-      </w:r>
-      <w:r>
-        <w:rPr>
-          <w:rFonts w:ascii="DB ChuanPim PSU Light" w:hAnsi="DB ChuanPim PSU Light" w:cs="DB ChuanPim PSU Light"/>
-          <w:sz w:val="32"/>
-          <w:szCs w:val="32"/>
-        </w:rPr>
-        <w:t>}}</w:t>
-      </w:r>
-      <w:r>
-        <w:rPr>
-          <w:rFonts w:ascii="DB ChuanPim PSU Light" w:hAnsi="DB ChuanPim PSU Light" w:cs="DB ChuanPim PSU Light"/>
-          <w:color w:val="000000" w:themeColor="text1"/>
-          <w:sz w:val="32"/>
-          <w:szCs w:val="32"/>
-          <w:cs/>
-        </w:rPr>
-        <w:tab/>
-      </w:r>
-      <w:r>
-        <w:rPr>
-          <w:rFonts w:ascii="DB ChuanPim PSU Light" w:hAnsi="DB ChuanPim PSU Light" w:cs="DB ChuanPim PSU Light"/>
-          <w:sz w:val="32"/>
-          <w:szCs w:val="32"/>
-          <w:cs/>
-        </w:rPr>
-        <w:tab/>
-        <w:t xml:space="preserve">                                  </w:t>
-      </w:r>
-      <w:r>
-        <w:rPr>
-          <w:rFonts w:ascii="DB ChuanPim PSU Light" w:hAnsi="DB ChuanPim PSU Light" w:cs="DB ChuanPim PSU Light"/>
-          <w:b/>
-          <w:bCs/>
-          <w:sz w:val="32"/>
-          <w:szCs w:val="32"/>
-          <w:cs/>
-        </w:rPr>
-        <w:t>วันที่</w:t>
-      </w:r>
-      <w:r>
-        <w:rPr>
-          <w:rFonts w:ascii="DB ChuanPim PSU Light" w:hAnsi="DB ChuanPim PSU Light" w:cs="DB ChuanPim PSU Light"/>
-          <w:sz w:val="32"/>
-          <w:szCs w:val="32"/>
-          <w:cs/>
-        </w:rPr>
-        <w:t xml:space="preserve">  </w:t>
-      </w:r>
-      <w:bookmarkStart w:id="1" w:name="_Hlk110525416"/>
-      <w:r>
-        <w:rPr>
-          <w:rFonts w:ascii="DB ChuanPim PSU Light" w:hAnsi="DB ChuanPim PSU Light" w:cs="DB ChuanPim PSU Light"/>
-          <w:sz w:val="32"/>
-          <w:szCs w:val="32"/>
-        </w:rPr>
-        <w:t>{{</w:t>
-      </w:r>
-      <w:r>
-        <w:rPr>
-          <w:rFonts w:ascii="DB ChuanPim PSU Light" w:hAnsi="DB ChuanPim PSU Light" w:cs="DB ChuanPim PSU Light" w:hint="cs"/>
-          <w:sz w:val="32"/>
-          <w:szCs w:val="32"/>
-          <w:cs/>
-        </w:rPr>
-        <w:t>วันที่</w:t>
-      </w:r>
-      <w:r>
-        <w:rPr>
-          <w:rFonts w:ascii="DB ChuanPim PSU Light" w:hAnsi="DB ChuanPim PSU Light" w:cs="DB ChuanPim PSU Light"/>
-          <w:sz w:val="32"/>
-          <w:szCs w:val="32"/>
-        </w:rPr>
-        <w:t>}}</w:t>
-      </w:r>
-      <w:bookmarkEnd w:id="1"/>
-    </w:p>
-    <w:p>
-      <w:pPr>
-        <w:pStyle w:val="2"/>
-        <w:spacing w:line="276" w:lineRule="auto"/>
-        <w:rPr>
-          <w:rFonts w:ascii="DB ChuanPim PSU Light" w:hAnsi="DB ChuanPim PSU Light" w:cs="DB ChuanPim PSU Light"/>
-          <w:cs/>
-        </w:rPr>
-      </w:pPr>
-      <w:r>
-        <w:rPr>
-          <w:rFonts w:ascii="DB ChuanPim PSU Light" w:hAnsi="DB ChuanPim PSU Light" w:cs="DB ChuanPim PSU Light"/>
-          <w:b/>
-          <w:bCs/>
-          <w:cs/>
-        </w:rPr>
-        <w:t>เรื่อง</w:t>
-      </w:r>
-      <w:r>
-        <w:rPr>
-          <w:rFonts w:ascii="DB ChuanPim PSU Light" w:hAnsi="DB ChuanPim PSU Light" w:cs="DB ChuanPim PSU Light"/>
-          <w:cs/>
-        </w:rPr>
-        <w:t xml:space="preserve">   </w:t>
-      </w:r>
-      <w:r>
-        <w:rPr>
-          <w:rFonts w:ascii="DB ChuanPim PSU Light" w:hAnsi="DB ChuanPim PSU Light" w:cs="DB ChuanPim PSU Light"/>
-        </w:rPr>
-        <w:t>{{</w:t>
-      </w:r>
-      <w:r>
-        <w:rPr>
-          <w:rFonts w:ascii="DB ChuanPim PSU Light" w:hAnsi="DB ChuanPim PSU Light" w:cs="DB ChuanPim PSU Light" w:hint="cs"/>
-          <w:cs/>
-        </w:rPr>
-        <w:t>เรื่อง</w:t>
-      </w:r>
-      <w:r>
-        <w:rPr>
-          <w:rFonts w:ascii="DB ChuanPim PSU Light" w:hAnsi="DB ChuanPim PSU Light" w:cs="DB ChuanPim PSU Light"/>
-        </w:rPr>
-        <w:t>}}</w:t>
-      </w:r>
-      <w:r>
-        <w:rPr>
-          <w:rFonts w:ascii="DB ChuanPim PSU Light" w:hAnsi="DB ChuanPim PSU Light" w:cs="DB ChuanPim PSU Light"/>
-          <w:cs/>
-        </w:rPr>
-        <w:t xml:space="preserve"> </w:t>
-      </w:r>
-      <w:r>
-        <w:rPr>
-          <w:rFonts w:ascii="DB ChuanPim PSU Light" w:hAnsi="DB ChuanPim PSU Light" w:cs="DB ChuanPim PSU Light"/>
-        </w:rPr>
-        <w:t xml:space="preserve"> </w:t>
-      </w:r>
-    </w:p>
-    <w:bookmarkEnd w:id="0"/>
-    <w:p>
-      <w:pPr>
-        <w:pStyle w:val="1"/>
-        <w:spacing w:before="240"/>
-        <w:rPr>
-          <w:rFonts w:ascii="DB ChuanPim PSU Light" w:hAnsi="DB ChuanPim PSU Light" w:cs="DB ChuanPim PSU Light"/>
-          <w:cs/>
-        </w:rPr>
-      </w:pPr>
-      <w:r>
-        <w:rPr>
-          <w:rFonts w:ascii="DB ChuanPim PSU Light" w:hAnsi="DB ChuanPim PSU Light" w:cs="DB ChuanPim PSU Light"/>
-          <w:b/>
-          <w:bCs/>
-          <w:cs/>
-        </w:rPr>
-        <w:t>เรียน</w:t>
-      </w:r>
-      <w:r>
-        <w:rPr>
-          <w:rFonts w:ascii="DB ChuanPim PSU Light" w:hAnsi="DB ChuanPim PSU Light" w:cs="DB ChuanPim PSU Light"/>
-          <w:cs/>
-        </w:rPr>
-        <w:t xml:space="preserve"> </w:t>
-      </w:r>
-      <w:r>
-        <w:rPr>
-          <w:rFonts w:ascii="DB ChuanPim PSU Light" w:hAnsi="DB ChuanPim PSU Light" w:cs="DB ChuanPim PSU Light"/>
-        </w:rPr>
-        <w:t xml:space="preserve">  {{</w:t>
-      </w:r>
-      <w:r>
-        <w:rPr>
-          <w:rFonts w:ascii="DB ChuanPim PSU Light" w:hAnsi="DB ChuanPim PSU Light" w:cs="DB ChuanPim PSU Light" w:hint="cs"/>
-          <w:cs/>
-        </w:rPr>
-        <w:t>เรียน</w:t>
-      </w:r>
-      <w:r>
-        <w:rPr>
-          <w:rFonts w:ascii="DB ChuanPim PSU Light" w:hAnsi="DB ChuanPim PSU Light" w:cs="DB ChuanPim PSU Light"/>
-        </w:rPr>
-        <w:t>}}</w:t>
-      </w:r>
-      <w:r>
-        <w:rPr>
-          <w:rFonts w:ascii="DB ChuanPim PSU Light" w:hAnsi="DB ChuanPim PSU Light" w:cs="DB ChuanPim PSU Light"/>
-          <w:cs/>
-        </w:rPr>
-        <w:t xml:space="preserve">   </w:t>
-      </w:r>
-    </w:p>
-    <w:p>
-      <w:pPr>
-        <w:pStyle w:val="a3"/>
-        <w:spacing w:before="240"/>
-        <w:ind w:firstLine="1418"/>
-        <w:jc w:val="thaiDistribute"/>
-        <w:rPr>
-          <w:rStyle w:val="rse6dlih"/>
-          <w:rFonts w:ascii="DB ChuanPim PSU Light" w:hAnsi="DB ChuanPim PSU Light" w:cs="DB ChuanPim PSU Light"/>
-          <w:color w:val="000000"/>
-          <w:cs/>
-        </w:rPr>
-      </w:pPr>
-      <w:r>
-        <w:rPr>
-          <w:rFonts w:ascii="DB ChuanPim PSU Light" w:hAnsi="DB ChuanPim PSU Light" w:cs="DB ChuanPim PSU Light"/>
-        </w:rPr>
-        <w:t>{{</w:t>
-      </w:r>
-      <w:r>
-        <w:rPr>
-          <w:rFonts w:ascii="DB ChuanPim PSU Light" w:hAnsi="DB ChuanPim PSU Light" w:cs="DB ChuanPim PSU Light" w:hint="cs"/>
-          <w:cs/>
-        </w:rPr>
-        <w:t>ภาคเหตุ</w:t>
-      </w:r>
-      <w:r>
-        <w:rPr>
-          <w:rFonts w:ascii="DB ChuanPim PSU Light" w:hAnsi="DB ChuanPim PSU Light" w:cs="DB ChuanPim PSU Light"/>
-        </w:rPr>
-        <w:t>}}</w:t>
-      </w:r>
-    </w:p>
-    <w:p>
-      <w:pPr>
-        <w:pStyle w:val="a3"/>
-        <w:spacing w:before="240"/>
-        <w:ind w:firstLine="1418"/>
-        <w:jc w:val="thaiDistribute"/>
-        <w:rPr>
-          <w:rFonts w:ascii="DB ChuanPim PSU Light" w:hAnsi="DB ChuanPim PSU Light" w:cs="DB ChuanPim PSU Light"/>
-        </w:rPr>
-      </w:pPr>
-      <w:r>
-        <w:rPr>
-          <w:rFonts w:ascii="DB ChuanPim PSU Light" w:hAnsi="DB ChuanPim PSU Light" w:cs="DB ChuanPim PSU Light"/>
-        </w:rPr>
-        <w:t>{{</w:t>
-      </w:r>
-      <w:r>
-        <w:rPr>
-          <w:rFonts w:ascii="DB ChuanPim PSU Light" w:hAnsi="DB ChuanPim PSU Light" w:cs="DB ChuanPim PSU Light" w:hint="cs"/>
-          <w:cs/>
-        </w:rPr>
-        <w:t>ภาคความประสงค์</w:t>
-      </w:r>
-      <w:r>
-        <w:rPr>
-          <w:rFonts w:ascii="DB ChuanPim PSU Light" w:hAnsi="DB ChuanPim PSU Light" w:cs="DB ChuanPim PSU Light"/>
-        </w:rPr>
-        <w:t>}}</w:t>
-      </w:r>
-    </w:p>
-    <w:p>
-      <w:pPr>
-        <w:pStyle w:val="a3"/>
-        <w:spacing w:before="240"/>
-        <w:ind w:firstLine="1418"/>
-        <w:jc w:val="thaiDistribute"/>
-        <w:rPr>
-          <w:rFonts w:ascii="DB ChuanPim PSU Light" w:hAnsi="DB ChuanPim PSU Light" w:cs="DB ChuanPim PSU Light"/>
-          <w:color w:val="000000"/>
-        </w:rPr>
-      </w:pPr>
-      <w:r>
-        <w:rPr>
-          <w:rFonts w:ascii="DB ChuanPim PSU Light" w:hAnsi="DB ChuanPim PSU Light" w:cs="DB ChuanPim PSU Light"/>
-        </w:rPr>
-        <w:t>{{</w:t>
-      </w:r>
-      <w:r>
-        <w:rPr>
-          <w:rFonts w:ascii="DB ChuanPim PSU Light" w:hAnsi="DB ChuanPim PSU Light" w:cs="DB ChuanPim PSU Light" w:hint="cs"/>
-          <w:cs/>
-        </w:rPr>
-        <w:t>ภาคสรุป</w:t>
-      </w:r>
-      <w:r>
-        <w:rPr>
-          <w:rFonts w:ascii="DB ChuanPim PSU Light" w:hAnsi="DB ChuanPim PSU Light" w:cs="DB ChuanPim PSU Light"/>
-        </w:rPr>
-        <w:t>}}</w:t>
-      </w:r>
-    </w:p>
-    <w:p>
-      <w:pPr>
-        <w:rPr>
-          <w:rFonts w:ascii="DB ChuanPim PSU Light" w:hAnsi="DB ChuanPim PSU Light" w:cs="DB ChuanPim PSU Light"/>
-          <w:sz w:val="32"/>
-          <w:szCs w:val="32"/>
-        </w:rPr>
-      </w:pPr>
-      <w:bookmarkStart w:id="2" w:name="_Hlk196728221"/>
-    </w:p>
-    <w:p>
-      <w:pPr>
-        <w:ind w:left="360" w:firstLine="1058"/>
-        <w:rPr>
-          <w:rFonts w:ascii="DB ChuanPim PSU Light" w:hAnsi="DB ChuanPim PSU Light" w:cs="DB ChuanPim PSU Light"/>
-          <w:sz w:val="32"/>
-          <w:szCs w:val="32"/>
-        </w:rPr>
-      </w:pPr>
-      <w:r>
-        <w:rPr>
-          <w:rFonts w:ascii="DB ChuanPim PSU Light" w:hAnsi="DB ChuanPim PSU Light" w:cs="DB ChuanPim PSU Light"/>
-          <w:sz w:val="32"/>
-          <w:szCs w:val="32"/>
-        </w:rPr>
-        <w:t>{{</w:t>
-      </w:r>
-      <w:r>
-        <w:rPr>
-          <w:rFonts w:ascii="DB ChuanPim PSU Light" w:hAnsi="DB ChuanPim PSU Light" w:cs="DB ChuanPim PSU Light"/>
-          <w:sz w:val="32"/>
-          <w:szCs w:val="32"/>
-          <w:cs/>
-        </w:rPr>
-        <w:t>จึงเรียนมาเพื่อ</w:t>
-      </w:r>
-      <w:r>
-        <w:rPr>
-          <w:rFonts w:ascii="DB ChuanPim PSU Light" w:hAnsi="DB ChuanPim PSU Light" w:cs="DB ChuanPim PSU Light" w:hint="cs"/>
-          <w:sz w:val="32"/>
-          <w:szCs w:val="32"/>
-          <w:cs/>
-        </w:rPr>
-        <w:t>...</w:t>
-      </w:r>
-      <w:r>
-        <w:rPr>
-          <w:rFonts w:ascii="DB ChuanPim PSU Light" w:hAnsi="DB ChuanPim PSU Light" w:cs="DB ChuanPim PSU Light"/>
-          <w:sz w:val="32"/>
-          <w:szCs w:val="32"/>
-        </w:rPr>
-        <w:t>}}</w:t>
-      </w:r>
-      <w:r>
-        <w:rPr>
-          <w:rFonts w:ascii="DB ChuanPim PSU Light" w:hAnsi="DB ChuanPim PSU Light" w:cs="DB ChuanPim PSU Light"/>
-          <w:sz w:val="32"/>
-          <w:szCs w:val="32"/>
-          <w:cs/>
-        </w:rPr>
-        <w:t xml:space="preserve"> </w:t>
-      </w:r>
-    </w:p>
-    <w:p>
-      <w:pPr>
-        <w:ind w:left="360" w:firstLine="720"/>
-        <w:rPr>
-          <w:rFonts w:ascii="DB ChuanPim PSU Light" w:hAnsi="DB ChuanPim PSU Light" w:cs="DB ChuanPim PSU Light"/>
-          <w:sz w:val="32"/>
-          <w:szCs w:val="32"/>
-        </w:rPr>
-      </w:pPr>
-    </w:p>
-    <w:p>
-      <w:pPr>
-        <w:spacing w:before="240"/>
-        <w:rPr>
-          <w:rFonts w:ascii="DB ChuanPim PSU Light" w:hAnsi="DB ChuanPim PSU Light" w:cs="DB ChuanPim PSU Light"/>
-          <w:sz w:val="32"/>
-          <w:szCs w:val="32"/>
-        </w:rPr>
-      </w:pPr>
-    </w:p>
-    <w:p>
-      <w:pPr>
-        <w:rPr>
-          <w:rFonts w:ascii="DB ChuanPim PSU Light" w:hAnsi="DB ChuanPim PSU Light" w:cs="DB ChuanPim PSU Light"/>
-          <w:sz w:val="32"/>
-          <w:szCs w:val="32"/>
-        </w:rPr>
-      </w:pPr>
-      <w:r>
-        <w:rPr>
-          <w:rFonts w:ascii="DB ChuanPim PSU Light" w:hAnsi="DB ChuanPim PSU Light" w:cs="DB ChuanPim PSU Light"/>
-          <w:sz w:val="32"/>
-          <w:szCs w:val="32"/>
-        </w:rPr>
-        <w:t xml:space="preserve">    </w:t>
-      </w:r>
-      <w:r>
-        <w:rPr>
-          <w:rFonts w:ascii="DB ChuanPim PSU Light" w:hAnsi="DB ChuanPim PSU Light" w:cs="DB ChuanPim PSU Light"/>
-          <w:sz w:val="32"/>
-          <w:szCs w:val="32"/>
-        </w:rPr>
-        <w:tab/>
-      </w:r>
-      <w:r>
-        <w:rPr>
-          <w:rFonts w:ascii="DB ChuanPim PSU Light" w:hAnsi="DB ChuanPim PSU Light" w:cs="DB ChuanPim PSU Light"/>
-          <w:sz w:val="32"/>
-          <w:szCs w:val="32"/>
-        </w:rPr>
-        <w:tab/>
-      </w:r>
-      <w:r>
-        <w:rPr>
-          <w:rFonts w:ascii="DB ChuanPim PSU Light" w:hAnsi="DB ChuanPim PSU Light" w:cs="DB ChuanPim PSU Light"/>
-          <w:sz w:val="32"/>
-          <w:szCs w:val="32"/>
-        </w:rPr>
-        <w:tab/>
-      </w:r>
-      <w:r>
-        <w:rPr>
-          <w:rFonts w:ascii="DB ChuanPim PSU Light" w:hAnsi="DB ChuanPim PSU Light" w:cs="DB ChuanPim PSU Light"/>
-          <w:sz w:val="32"/>
-          <w:szCs w:val="32"/>
-          <w:cs/>
-        </w:rPr>
-        <w:tab/>
-      </w:r>
-      <w:r>
-        <w:rPr>
-          <w:rFonts w:ascii="DB ChuanPim PSU Light" w:hAnsi="DB ChuanPim PSU Light" w:cs="DB ChuanPim PSU Light"/>
-          <w:sz w:val="32"/>
-          <w:szCs w:val="32"/>
-          <w:cs/>
-        </w:rPr>
-        <w:tab/>
-      </w:r>
-      <w:r>
-        <w:rPr>
-          <w:rFonts w:ascii="DB ChuanPim PSU Light" w:hAnsi="DB ChuanPim PSU Light" w:cs="DB ChuanPim PSU Light"/>
-          <w:sz w:val="32"/>
-          <w:szCs w:val="32"/>
-          <w:cs/>
-        </w:rPr>
-        <w:tab/>
-      </w:r>
-      <w:r>
-        <w:rPr>
-          <w:rFonts w:ascii="DB ChuanPim PSU Light" w:hAnsi="DB ChuanPim PSU Light" w:cs="DB ChuanPim PSU Light"/>
-          <w:sz w:val="32"/>
-          <w:szCs w:val="32"/>
-          <w:cs/>
-        </w:rPr>
-        <w:tab/>
-        <w:t>(</w:t>
-      </w:r>
-      <w:r>
-        <w:rPr>
-          <w:rFonts w:ascii="DB ChuanPim PSU Light" w:hAnsi="DB ChuanPim PSU Light" w:cs="DB ChuanPim PSU Light"/>
-          <w:sz w:val="32"/>
-          <w:szCs w:val="32"/>
-        </w:rPr>
-        <w:t>{{</w:t>
-      </w:r>
-      <w:r>
-        <w:rPr>
-          <w:rFonts w:ascii="DB ChuanPim PSU Light" w:hAnsi="DB ChuanPim PSU Light" w:cs="DB ChuanPim PSU Light" w:hint="cs"/>
-          <w:sz w:val="32"/>
-          <w:szCs w:val="32"/>
-          <w:cs/>
-        </w:rPr>
-        <w:t>ลงชื่อ</w:t>
-      </w:r>
-      <w:r>
-        <w:rPr>
-          <w:rFonts w:ascii="DB ChuanPim PSU Light" w:hAnsi="DB ChuanPim PSU Light" w:cs="DB ChuanPim PSU Light"/>
-          <w:sz w:val="32"/>
-          <w:szCs w:val="32"/>
-        </w:rPr>
-        <w:t>1}}</w:t>
-      </w:r>
-      <w:r>
-        <w:rPr>
-          <w:rFonts w:ascii="DB ChuanPim PSU Light" w:hAnsi="DB ChuanPim PSU Light" w:cs="DB ChuanPim PSU Light"/>
-          <w:sz w:val="32"/>
-          <w:szCs w:val="32"/>
-          <w:cs/>
-        </w:rPr>
-        <w:t>)</w:t>
-      </w:r>
-      <w:r>
-        <w:rPr>
-          <w:rFonts w:ascii="DB ChuanPim PSU Light" w:hAnsi="DB ChuanPim PSU Light" w:cs="DB ChuanPim PSU Light"/>
-          <w:sz w:val="32"/>
-          <w:szCs w:val="32"/>
-        </w:rPr>
-        <w:tab/>
-      </w:r>
-      <w:r>
-        <w:rPr>
-          <w:rFonts w:ascii="DB ChuanPim PSU Light" w:hAnsi="DB ChuanPim PSU Light" w:cs="DB ChuanPim PSU Light"/>
-          <w:sz w:val="32"/>
-          <w:szCs w:val="32"/>
-        </w:rPr>
-        <w:tab/>
-      </w:r>
-      <w:r>
-        <w:rPr>
-          <w:rFonts w:ascii="DB ChuanPim PSU Light" w:hAnsi="DB ChuanPim PSU Light" w:cs="DB ChuanPim PSU Light"/>
-          <w:sz w:val="32"/>
-          <w:szCs w:val="32"/>
-        </w:rPr>
-        <w:tab/>
-      </w:r>
-      <w:r>
-        <w:rPr>
-          <w:rFonts w:ascii="DB ChuanPim PSU Light" w:hAnsi="DB ChuanPim PSU Light" w:cs="DB ChuanPim PSU Light"/>
-          <w:sz w:val="32"/>
-          <w:szCs w:val="32"/>
-        </w:rPr>
-        <w:tab/>
-      </w:r>
-      <w:r>
-        <w:rPr>
-          <w:rFonts w:ascii="DB ChuanPim PSU Light" w:hAnsi="DB ChuanPim PSU Light" w:cs="DB ChuanPim PSU Light"/>
-          <w:sz w:val="32"/>
-          <w:szCs w:val="32"/>
-        </w:rPr>
-        <w:tab/>
-      </w:r>
-      <w:r>
-        <w:rPr>
-          <w:rFonts w:ascii="DB ChuanPim PSU Light" w:hAnsi="DB ChuanPim PSU Light" w:cs="DB ChuanPim PSU Light"/>
-          <w:sz w:val="32"/>
-          <w:szCs w:val="32"/>
-        </w:rPr>
-        <w:tab/>
-      </w:r>
-      <w:r>
-        <w:rPr>
-          <w:rFonts w:ascii="DB ChuanPim PSU Light" w:hAnsi="DB ChuanPim PSU Light" w:cs="DB ChuanPim PSU Light"/>
-          <w:sz w:val="32"/>
-          <w:szCs w:val="32"/>
-        </w:rPr>
-        <w:tab/>
-      </w:r>
-      <w:r>
-        <w:rPr>
-          <w:rFonts w:ascii="DB ChuanPim PSU Light" w:hAnsi="DB ChuanPim PSU Light" w:cs="DB ChuanPim PSU Light"/>
-          <w:sz w:val="32"/>
-          <w:szCs w:val="32"/>
-        </w:rPr>
-        <w:tab/>
-      </w:r>
-      <w:r>
-        <w:rPr>
-          <w:rFonts w:ascii="DB ChuanPim PSU Light" w:hAnsi="DB ChuanPim PSU Light" w:cs="DB ChuanPim PSU Light"/>
-          <w:sz w:val="32"/>
-          <w:szCs w:val="32"/>
-          <w:cs/>
-        </w:rPr>
-        <w:t xml:space="preserve">     </w:t>
-      </w:r>
-      <w:r>
-        <w:rPr>
-          <w:rFonts w:ascii="DB ChuanPim PSU Light" w:hAnsi="DB ChuanPim PSU Light" w:cs="DB ChuanPim PSU Light" w:hint="cs"/>
-          <w:sz w:val="32"/>
-          <w:szCs w:val="32"/>
-          <w:cs/>
-        </w:rPr>
-        <w:t xml:space="preserve">  </w:t>
-      </w:r>
-      <w:r>
-        <w:rPr>
-          <w:rFonts w:ascii="DB ChuanPim PSU Light" w:hAnsi="DB ChuanPim PSU Light" w:cs="DB ChuanPim PSU Light"/>
-          <w:sz w:val="32"/>
-          <w:szCs w:val="32"/>
-        </w:rPr>
-        <w:t xml:space="preserve">                   {{</w:t>
-      </w:r>
-      <w:r>
-        <w:rPr>
-          <w:rFonts w:ascii="DB ChuanPim PSU Light" w:hAnsi="DB ChuanPim PSU Light" w:cs="DB ChuanPim PSU Light" w:hint="cs"/>
-          <w:sz w:val="32"/>
-          <w:szCs w:val="32"/>
-          <w:cs/>
-        </w:rPr>
-        <w:t>ตำแหน่ง</w:t>
-      </w:r>
-      <w:r>
-        <w:rPr>
-          <w:rFonts w:ascii="DB ChuanPim PSU Light" w:hAnsi="DB ChuanPim PSU Light" w:cs="DB ChuanPim PSU Light"/>
-          <w:sz w:val="32"/>
-          <w:szCs w:val="32"/>
-        </w:rPr>
-        <w:t>1}}</w:t>
-      </w:r>
-    </w:p>
-    <w:p>
-      <w:pPr>
-        <w:rPr>
-          <w:rFonts w:ascii="DB ChuanPim PSU Light" w:hAnsi="DB ChuanPim PSU Light" w:cs="DB ChuanPim PSU Light"/>
-          <w:sz w:val="32"/>
-          <w:szCs w:val="32"/>
-        </w:rPr>
-      </w:pPr>
-      <w:r>
-        <w:rPr>
-          <w:rFonts w:ascii="DB ChuanPim PSU Light" w:hAnsi="DB ChuanPim PSU Light" w:cs="DB ChuanPim PSU Light"/>
-          <w:sz w:val="32"/>
-          <w:szCs w:val="32"/>
-          <w:cs/>
-        </w:rPr>
-        <w:tab/>
-      </w:r>
-      <w:r>
-        <w:rPr>
-          <w:rFonts w:ascii="DB ChuanPim PSU Light" w:hAnsi="DB ChuanPim PSU Light" w:cs="DB ChuanPim PSU Light"/>
-          <w:sz w:val="32"/>
-          <w:szCs w:val="32"/>
-          <w:cs/>
-        </w:rPr>
-        <w:tab/>
-      </w:r>
-      <w:r>
-        <w:rPr>
-          <w:rFonts w:ascii="DB ChuanPim PSU Light" w:hAnsi="DB ChuanPim PSU Light" w:cs="DB ChuanPim PSU Light"/>
-          <w:sz w:val="32"/>
-          <w:szCs w:val="32"/>
-          <w:cs/>
-        </w:rPr>
-        <w:tab/>
-      </w:r>
-      <w:r>
-        <w:rPr>
-          <w:rFonts w:ascii="DB ChuanPim PSU Light" w:hAnsi="DB ChuanPim PSU Light" w:cs="DB ChuanPim PSU Light"/>
-          <w:sz w:val="32"/>
-          <w:szCs w:val="32"/>
-          <w:cs/>
-        </w:rPr>
-        <w:tab/>
-      </w:r>
-      <w:r>
-        <w:rPr>
-          <w:rFonts w:ascii="DB ChuanPim PSU Light" w:hAnsi="DB ChuanPim PSU Light" w:cs="DB ChuanPim PSU Light"/>
-          <w:sz w:val="32"/>
-          <w:szCs w:val="32"/>
-          <w:cs/>
-        </w:rPr>
-        <w:tab/>
-      </w:r>
-      <w:r>
-        <w:rPr>
-          <w:rFonts w:ascii="DB ChuanPim PSU Light" w:hAnsi="DB ChuanPim PSU Light" w:cs="DB ChuanPim PSU Light"/>
-          <w:sz w:val="32"/>
-          <w:szCs w:val="32"/>
-        </w:rPr>
-        <w:t xml:space="preserve">                   {{</w:t>
-      </w:r>
-      <w:r>
-        <w:rPr>
-          <w:rFonts w:ascii="DB ChuanPim PSU Light" w:hAnsi="DB ChuanPim PSU Light" w:cs="DB ChuanPim PSU Light" w:hint="cs"/>
-          <w:sz w:val="32"/>
-          <w:szCs w:val="32"/>
-          <w:cs/>
-        </w:rPr>
-        <w:t>วันที่</w:t>
-      </w:r>
-      <w:r>
-        <w:rPr>
-          <w:rFonts w:ascii="DB ChuanPim PSU Light" w:hAnsi="DB ChuanPim PSU Light" w:cs="DB ChuanPim PSU Light"/>
-          <w:sz w:val="32"/>
-          <w:szCs w:val="32"/>
-        </w:rPr>
-        <w:t>}}</w:t>
-      </w:r>
-    </w:p>
-    <w:p>
-      <w:pPr>
-        <w:rPr>
-          <w:rFonts w:ascii="DB ChuanPim PSU Light" w:hAnsi="DB ChuanPim PSU Light" w:cs="DB ChuanPim PSU Light"/>
-          <w:sz w:val="30"/>
-          <w:szCs w:val="30"/>
-        </w:rPr>
-      </w:pPr>
-    </w:p>
-    <w:bookmarkEnd w:id="2"/>
-    <w:p>
-      <w:pPr>
-        <w:ind w:left="3600" w:firstLine="720"/>
-        <w:rPr>
-          <w:rFonts w:ascii="DB ChuanPim PSU Light" w:hAnsi="DB ChuanPim PSU Light" w:cs="DB ChuanPim PSU Light"/>
-          <w:sz w:val="30"/>
-          <w:szCs w:val="30"/>
-        </w:rPr>
-      </w:pPr>
-    </w:p>
-    <w:p>
-      <w:pPr>
-        <w:ind w:left="4320"/>
-        <w:rPr>
-          <w:rFonts w:ascii="DB ChuanPim PSU Light" w:hAnsi="DB ChuanPim PSU Light" w:cs="DB ChuanPim PSU Light"/>
-          <w:sz w:val="32"/>
-          <w:szCs w:val="32"/>
-        </w:rPr>
-      </w:pPr>
-      <w:r>
-        <w:rPr>
-          <w:rFonts w:ascii="DB ChuanPim PSU Light" w:hAnsi="DB ChuanPim PSU Light" w:cs="DB ChuanPim PSU Light"/>
-          <w:sz w:val="32"/>
-          <w:szCs w:val="32"/>
-        </w:rPr>
-        <w:t xml:space="preserve">         </w:t>
-      </w:r>
-      <w:r>
-        <w:rPr>
-          <w:rFonts w:ascii="DB ChuanPim PSU Light" w:hAnsi="DB ChuanPim PSU Light" w:cs="DB ChuanPim PSU Light"/>
-          <w:sz w:val="32"/>
-          <w:szCs w:val="32"/>
-          <w:cs/>
-        </w:rPr>
-        <w:t>(</w:t>
-      </w:r>
-      <w:r>
-        <w:rPr>
-          <w:rFonts w:ascii="DB ChuanPim PSU Light" w:hAnsi="DB ChuanPim PSU Light" w:cs="DB ChuanPim PSU Light"/>
-          <w:sz w:val="32"/>
-          <w:szCs w:val="32"/>
-        </w:rPr>
-        <w:t>{{</w:t>
-      </w:r>
-      <w:r>
-        <w:rPr>
-          <w:rFonts w:ascii="DB ChuanPim PSU Light" w:hAnsi="DB ChuanPim PSU Light" w:cs="DB ChuanPim PSU Light" w:hint="cs"/>
-          <w:sz w:val="32"/>
-          <w:szCs w:val="32"/>
-          <w:cs/>
-        </w:rPr>
-        <w:t>ลงชื่อ2</w:t>
-      </w:r>
-      <w:r>
-        <w:rPr>
-          <w:rFonts w:ascii="DB ChuanPim PSU Light" w:hAnsi="DB ChuanPim PSU Light" w:cs="DB ChuanPim PSU Light"/>
-          <w:sz w:val="32"/>
-          <w:szCs w:val="32"/>
-        </w:rPr>
-        <w:t>}}</w:t>
-      </w:r>
-      <w:r>
-        <w:rPr>
-          <w:rFonts w:ascii="DB ChuanPim PSU Light" w:hAnsi="DB ChuanPim PSU Light" w:cs="DB ChuanPim PSU Light"/>
-          <w:sz w:val="32"/>
-          <w:szCs w:val="32"/>
-          <w:cs/>
-        </w:rPr>
-        <w:t>)</w:t>
-      </w:r>
-      <w:r>
-        <w:rPr>
-          <w:rFonts w:ascii="DB ChuanPim PSU Light" w:hAnsi="DB ChuanPim PSU Light" w:cs="DB ChuanPim PSU Light"/>
-          <w:sz w:val="32"/>
-          <w:szCs w:val="32"/>
-        </w:rPr>
-        <w:tab/>
-      </w:r>
-    </w:p>
-    <w:p>
-      <w:pPr>
-        <w:ind w:left="3600" w:firstLine="720"/>
-        <w:rPr>
-          <w:rFonts w:ascii="DB ChuanPim PSU Light" w:hAnsi="DB ChuanPim PSU Light" w:cs="DB ChuanPim PSU Light"/>
-        </w:rPr>
-      </w:pPr>
-      <w:r>
-        <w:rPr>
-          <w:rFonts w:ascii="DB ChuanPim PSU Light" w:hAnsi="DB ChuanPim PSU Light" w:cs="DB ChuanPim PSU Light"/>
-          <w:sz w:val="32"/>
-          <w:szCs w:val="32"/>
-        </w:rPr>
-        <w:t xml:space="preserve">        {{</w:t>
-      </w:r>
-      <w:r>
-        <w:rPr>
-          <w:rFonts w:ascii="DB ChuanPim PSU Light" w:hAnsi="DB ChuanPim PSU Light" w:cs="DB ChuanPim PSU Light" w:hint="cs"/>
-          <w:sz w:val="32"/>
-          <w:szCs w:val="32"/>
-          <w:cs/>
-        </w:rPr>
-        <w:t>ตำแหน่ง</w:t>
-      </w:r>
-      <w:r>
-        <w:rPr>
-          <w:rFonts w:ascii="DB ChuanPim PSU Light" w:hAnsi="DB ChuanPim PSU Light" w:cs="DB ChuanPim PSU Light"/>
-          <w:sz w:val="32"/>
-          <w:szCs w:val="32"/>
-        </w:rPr>
-        <w:t>2</w:t>
-      </w:r>
-      <w:r>
-        <w:rPr>
-          <w:rFonts w:ascii="DB ChuanPim PSU Light" w:hAnsi="DB ChuanPim PSU Light" w:cs="DB ChuanPim PSU Light"/>
-          <w:sz w:val="32"/>
-          <w:szCs w:val="32"/>
-        </w:rPr>
-        <w:t>}}</w:t>
-      </w:r>
-      <w:r>
-        <w:rPr>
-          <w:rFonts w:ascii="DB ChuanPim PSU Light" w:hAnsi="DB ChuanPim PSU Light" w:cs="DB ChuanPim PSU Light"/>
-        </w:rPr>
-        <w:t xml:space="preserve">           </w:t>
-      </w:r>
-    </w:p>
-    <w:p>
-      <w:pPr>
-        <w:rPr>
-          <w:rFonts w:ascii="DB ChuanPim PSU Light" w:hAnsi="DB ChuanPim PSU Light" w:cs="DB ChuanPim PSU Light"/>
-          <w:sz w:val="30"/>
-          <w:szCs w:val="30"/>
-        </w:rPr>
-      </w:pPr>
-      <w:r>
-        <w:rPr>
-          <w:rFonts w:ascii="DB ChuanPim PSU Light" w:hAnsi="DB ChuanPim PSU Light" w:cs="DB ChuanPim PSU Light"/>
-        </w:rPr>
-        <w:t xml:space="preserve">     </w:t>
-      </w:r>
-      <w:r>
-        <w:rPr>
-          <w:rFonts w:ascii="DB ChuanPim PSU Light" w:hAnsi="DB ChuanPim PSU Light" w:cs="DB ChuanPim PSU Light"/>
-        </w:rPr>
-        <w:tab/>
-      </w:r>
-      <w:r>
-        <w:rPr>
-          <w:rFonts w:ascii="DB ChuanPim PSU Light" w:hAnsi="DB ChuanPim PSU Light" w:cs="DB ChuanPim PSU Light"/>
-        </w:rPr>
-        <w:tab/>
-      </w:r>
-      <w:r>
-        <w:rPr>
-          <w:rFonts w:ascii="DB ChuanPim PSU Light" w:hAnsi="DB ChuanPim PSU Light" w:cs="DB ChuanPim PSU Light"/>
-        </w:rPr>
-        <w:tab/>
-      </w:r>
-      <w:r>
-        <w:rPr>
-          <w:rFonts w:ascii="DB ChuanPim PSU Light" w:hAnsi="DB ChuanPim PSU Light" w:cs="DB ChuanPim PSU Light"/>
-        </w:rPr>
-        <w:tab/>
-      </w:r>
-      <w:r>
-        <w:rPr>
-          <w:rFonts w:ascii="DB ChuanPim PSU Light" w:hAnsi="DB ChuanPim PSU Light" w:cs="DB ChuanPim PSU Light"/>
-        </w:rPr>
-        <w:tab/>
-        <w:t xml:space="preserve">      ……..……/……..……/…………..</w:t>
-      </w:r>
-    </w:p>
-    <w:p>
-      <w:pPr>
-        <w:rPr>
-          <w:rFonts w:ascii="DB ChuanPim PSU Light" w:hAnsi="DB ChuanPim PSU Light" w:cs="DB ChuanPim PSU Light"/>
-          <w:sz w:val="30"/>
-          <w:szCs w:val="30"/>
-        </w:rPr>
-      </w:pPr>
-    </w:p>
-    <w:p>
-      <w:pPr>
-        <w:ind w:left="3600" w:firstLine="720"/>
-        <w:rPr>
-          <w:rFonts w:ascii="DB ChuanPim PSU Light" w:hAnsi="DB ChuanPim PSU Light" w:cs="DB ChuanPim PSU Light"/>
-          <w:sz w:val="30"/>
-          <w:szCs w:val="30"/>
-        </w:rPr>
-      </w:pPr>
-    </w:p>
-    <w:p>
-      <w:pPr>
-        <w:ind w:left="4320"/>
-        <w:rPr>
-          <w:rFonts w:ascii="DB ChuanPim PSU Light" w:hAnsi="DB ChuanPim PSU Light" w:cs="DB ChuanPim PSU Light"/>
-          <w:sz w:val="32"/>
-          <w:szCs w:val="32"/>
-        </w:rPr>
-      </w:pPr>
-      <w:r>
-        <w:rPr>
-          <w:rFonts w:ascii="DB ChuanPim PSU Light" w:hAnsi="DB ChuanPim PSU Light" w:cs="DB ChuanPim PSU Light"/>
-          <w:sz w:val="32"/>
-          <w:szCs w:val="32"/>
-        </w:rPr>
-        <w:t xml:space="preserve">         </w:t>
-      </w:r>
-      <w:r>
-        <w:rPr>
-          <w:rFonts w:ascii="DB ChuanPim PSU Light" w:hAnsi="DB ChuanPim PSU Light" w:cs="DB ChuanPim PSU Light"/>
-          <w:sz w:val="32"/>
-          <w:szCs w:val="32"/>
-          <w:cs/>
-        </w:rPr>
-        <w:t>(</w:t>
-      </w:r>
-      <w:r>
-        <w:rPr>
-          <w:rFonts w:ascii="DB ChuanPim PSU Light" w:hAnsi="DB ChuanPim PSU Light" w:cs="DB ChuanPim PSU Light"/>
-          <w:sz w:val="32"/>
-          <w:szCs w:val="32"/>
-        </w:rPr>
-        <w:t>{{</w:t>
-      </w:r>
-      <w:r>
-        <w:rPr>
-          <w:rFonts w:ascii="DB ChuanPim PSU Light" w:hAnsi="DB ChuanPim PSU Light" w:cs="DB ChuanPim PSU Light" w:hint="cs"/>
-          <w:sz w:val="32"/>
-          <w:szCs w:val="32"/>
-          <w:cs/>
-        </w:rPr>
-        <w:t>ลงชื่อ</w:t>
-      </w:r>
-      <w:r>
-        <w:rPr>
-          <w:rFonts w:ascii="DB ChuanPim PSU Light" w:hAnsi="DB ChuanPim PSU Light" w:cs="DB ChuanPim PSU Light"/>
-          <w:sz w:val="32"/>
-          <w:szCs w:val="32"/>
-        </w:rPr>
-        <w:t>3</w:t>
-      </w:r>
-      <w:r>
-        <w:rPr>
-          <w:rFonts w:ascii="DB ChuanPim PSU Light" w:hAnsi="DB ChuanPim PSU Light" w:cs="DB ChuanPim PSU Light"/>
-          <w:sz w:val="32"/>
-          <w:szCs w:val="32"/>
-        </w:rPr>
-        <w:t>}}</w:t>
-      </w:r>
-      <w:r>
-        <w:rPr>
-          <w:rFonts w:ascii="DB ChuanPim PSU Light" w:hAnsi="DB ChuanPim PSU Light" w:cs="DB ChuanPim PSU Light"/>
-          <w:sz w:val="32"/>
-          <w:szCs w:val="32"/>
-          <w:cs/>
-        </w:rPr>
-        <w:t>)</w:t>
-      </w:r>
-      <w:r>
-        <w:rPr>
-          <w:rFonts w:ascii="DB ChuanPim PSU Light" w:hAnsi="DB ChuanPim PSU Light" w:cs="DB ChuanPim PSU Light"/>
-          <w:sz w:val="32"/>
-          <w:szCs w:val="32"/>
-        </w:rPr>
-        <w:tab/>
-      </w:r>
-    </w:p>
-    <w:p>
-      <w:pPr>
-        <w:ind w:left="3600" w:firstLine="720"/>
-        <w:rPr>
-          <w:rFonts w:ascii="DB ChuanPim PSU Light" w:hAnsi="DB ChuanPim PSU Light" w:cs="DB ChuanPim PSU Light"/>
-        </w:rPr>
-      </w:pPr>
-      <w:r>
-        <w:rPr>
-          <w:rFonts w:ascii="DB ChuanPim PSU Light" w:hAnsi="DB ChuanPim PSU Light" w:cs="DB ChuanPim PSU Light"/>
-          <w:sz w:val="32"/>
-          <w:szCs w:val="32"/>
-        </w:rPr>
-        <w:t xml:space="preserve">        {{</w:t>
-      </w:r>
-      <w:r>
-        <w:rPr>
-          <w:rFonts w:ascii="DB ChuanPim PSU Light" w:hAnsi="DB ChuanPim PSU Light" w:cs="DB ChuanPim PSU Light" w:hint="cs"/>
-          <w:sz w:val="32"/>
-          <w:szCs w:val="32"/>
-          <w:cs/>
-        </w:rPr>
-        <w:t>ตำแหน่ง</w:t>
-      </w:r>
-      <w:r>
-        <w:rPr>
-          <w:rFonts w:ascii="DB ChuanPim PSU Light" w:hAnsi="DB ChuanPim PSU Light" w:cs="DB ChuanPim PSU Light"/>
-          <w:sz w:val="32"/>
-          <w:szCs w:val="32"/>
-        </w:rPr>
-        <w:t>3</w:t>
-      </w:r>
-      <w:r>
-        <w:rPr>
-          <w:rFonts w:ascii="DB ChuanPim PSU Light" w:hAnsi="DB ChuanPim PSU Light" w:cs="DB ChuanPim PSU Light"/>
-          <w:sz w:val="32"/>
-          <w:szCs w:val="32"/>
-        </w:rPr>
-        <w:t>}}</w:t>
-      </w:r>
-      <w:r>
-        <w:rPr>
-          <w:rFonts w:ascii="DB ChuanPim PSU Light" w:hAnsi="DB ChuanPim PSU Light" w:cs="DB ChuanPim PSU Light"/>
-        </w:rPr>
-        <w:t xml:space="preserve">           </w:t>
-      </w:r>
-    </w:p>
-    <w:p>
-      <w:pPr>
-        <w:rPr>
-          <w:rFonts w:ascii="DB ChuanPim PSU Light" w:hAnsi="DB ChuanPim PSU Light" w:cs="DB ChuanPim PSU Light"/>
-          <w:sz w:val="30"/>
-          <w:szCs w:val="30"/>
-        </w:rPr>
-      </w:pPr>
-      <w:r>
-        <w:rPr>
-          <w:rFonts w:ascii="DB ChuanPim PSU Light" w:hAnsi="DB ChuanPim PSU Light" w:cs="DB ChuanPim PSU Light"/>
-        </w:rPr>
-        <w:t xml:space="preserve">     </w:t>
-      </w:r>
-      <w:r>
-        <w:rPr>
-          <w:rFonts w:ascii="DB ChuanPim PSU Light" w:hAnsi="DB ChuanPim PSU Light" w:cs="DB ChuanPim PSU Light"/>
-        </w:rPr>
-        <w:tab/>
-      </w:r>
-      <w:r>
-        <w:rPr>
-          <w:rFonts w:ascii="DB ChuanPim PSU Light" w:hAnsi="DB ChuanPim PSU Light" w:cs="DB ChuanPim PSU Light"/>
-        </w:rPr>
-        <w:tab/>
-      </w:r>
-      <w:r>
-        <w:rPr>
-          <w:rFonts w:ascii="DB ChuanPim PSU Light" w:hAnsi="DB ChuanPim PSU Light" w:cs="DB ChuanPim PSU Light"/>
-        </w:rPr>
-        <w:tab/>
-      </w:r>
-      <w:r>
-        <w:rPr>
-          <w:rFonts w:ascii="DB ChuanPim PSU Light" w:hAnsi="DB ChuanPim PSU Light" w:cs="DB ChuanPim PSU Light"/>
-        </w:rPr>
-        <w:tab/>
-      </w:r>
-      <w:r>
-        <w:rPr>
-          <w:rFonts w:ascii="DB ChuanPim PSU Light" w:hAnsi="DB ChuanPim PSU Light" w:cs="DB ChuanPim PSU Light"/>
-        </w:rPr>
-        <w:tab/>
-        <w:t xml:space="preserve">      ……..……/……..……/…………..</w:t>
-      </w:r>
-    </w:p>
-    <w:p>
-      <w:pPr>
-        <w:ind w:left="3600" w:firstLine="720"/>
-        <w:rPr>
-          <w:rFonts w:ascii="TH SarabunPSK" w:hAnsi="TH SarabunPSK" w:cs="TH SarabunPSK"/>
-          <w:sz w:val="30"/>
-          <w:szCs w:val="30"/>
-        </w:rPr>
-      </w:pPr>
-      <w:r>
-        <w:rPr>
-          <w:rFonts w:ascii="TH SarabunPSK" w:hAnsi="TH SarabunPSK" w:cs="TH SarabunPSK"/>
-          <w:sz w:val="30"/>
-          <w:szCs w:val="30"/>
-          <w:cs/>
-        </w:rPr>
-        <w:tab/>
-      </w:r>
-    </w:p>
-    <w:p>
-      <w:pPr>
-        <w:jc w:val="center"/>
-        <w:rPr>
-          <w:rFonts w:ascii="DB ChuanPim PSU Light" w:hAnsi="DB ChuanPim PSU Light" w:cs="DB ChuanPim PSU Light"/>
-          <w:b/>
-          <w:bCs/>
-          <w:cs/>
-        </w:rPr>
-      </w:pPr>
-      <w:r>
-        <w:rPr>
-          <w:rFonts w:ascii="TH SarabunPSK" w:hAnsi="TH SarabunPSK" w:cs="TH SarabunPSK"/>
-          <w:sz w:val="30"/>
-          <w:szCs w:val="30"/>
-          <w:cs/>
-        </w:rPr>
-        <w:tab/>
-      </w:r>
-      <w:r>
-        <w:rPr>
-          <w:rFonts w:ascii="TH SarabunPSK" w:hAnsi="TH SarabunPSK" w:cs="TH SarabunPSK"/>
-          <w:sz w:val="30"/>
-          <w:szCs w:val="30"/>
-          <w:cs/>
-        </w:rPr>
-        <w:tab/>
-      </w:r>
-      <w:r>
-        <w:rPr>
-          <w:rFonts w:ascii="TH SarabunPSK" w:hAnsi="TH SarabunPSK" w:cs="TH SarabunPSK"/>
-          <w:sz w:val="30"/>
-          <w:szCs w:val="30"/>
-          <w:cs/>
-        </w:rPr>
-        <w:tab/>
-      </w:r>
-      <w:r>
-        <w:rPr>
-          <w:rFonts w:ascii="TH SarabunPSK" w:hAnsi="TH SarabunPSK" w:cs="TH SarabunPSK"/>
-          <w:sz w:val="30"/>
-          <w:szCs w:val="30"/>
-          <w:cs/>
-        </w:rPr>
-        <w:tab/>
-      </w:r>
-      <w:r>
-        <w:rPr>
-          <w:rFonts w:ascii="TH SarabunPSK" w:hAnsi="TH SarabunPSK" w:cs="TH SarabunPSK"/>
-          <w:sz w:val="30"/>
-          <w:szCs w:val="30"/>
-          <w:cs/>
-        </w:rPr>
-        <w:tab/>
-      </w:r>
-      <w:r>
-        <w:rPr>
-          <w:rFonts w:ascii="TH SarabunPSK" w:hAnsi="TH SarabunPSK" w:cs="TH SarabunPSK"/>
-          <w:sz w:val="30"/>
-          <w:szCs w:val="30"/>
-          <w:cs/>
-        </w:rPr>
-        <w:tab/>
-      </w:r>
-      <w:r>
-        <w:rPr>
-          <w:rFonts w:ascii="TH SarabunPSK" w:hAnsi="TH SarabunPSK" w:cs="TH SarabunPSK" w:hint="cs"/>
-          <w:sz w:val="30"/>
-          <w:szCs w:val="30"/>
-          <w:cs/>
-        </w:rPr>
-        <w:t xml:space="preserve">        </w:t>
-      </w:r>
-    </w:p>
-    <w:sectPr>
-      <w:headerReference w:type="default" r:id="rId9"/>
-      <w:pgSz w:w="11906" w:h="16838"/>
-      <w:pgMar w:top="851" w:right="1134" w:bottom="851" w:left="1701" w:header="709" w:footer="709" w:gutter="0"/>
-      <w:pgNumType w:fmt="thaiLetters"/>
-      <w:cols w:space="708"/>
-      <w:docGrid w:linePitch="381"/>
-    </w:sectPr>
-  </w:body>
-</w:document>
+<file path=word/document.xml><?xml version="1.0" encoding="UTF-8" standalone="yes"?>
+<w:document xmlns:wpc="http://schemas.microsoft.com/office/word/2010/wordprocessingCanvas" xmlns:cx="http://schemas.microsoft.com/office/drawing/2014/chartex" xmlns:cx1="http://schemas.microsoft.com/office/drawing/2015/9/8/chartex" xmlns:cx2="http://schemas.microsoft.com/office/drawing/2015/10/21/chartex" xmlns:cx3="http://schemas.microsoft.com/office/drawing/2016/5/9/chartex" xmlns:cx4="http://schemas.microsoft.com/office/drawing/2016/5/10/chartex" xmlns:cx5="http://schemas.microsoft.com/office/drawing/2016/5/11/chartex" xmlns:cx6="http://schemas.microsoft.com/office/drawing/2016/5/12/chartex" xmlns:cx7="http://schemas.microsoft.com/office/drawing/2016/5/13/chartex" xmlns:cx8="http://schemas.microsoft.com/office/drawing/2016/5/14/chartex" xmlns:mc="http://schemas.openxmlformats.org/markup-compatibility/2006" xmlns:aink="http://schemas.microsoft.com/office/drawing/2016/ink" xmlns:am3d="http://schemas.microsoft.com/office/drawing/2017/model3d" xmlns:o="urn:schemas-microsoft-com:office:office" xmlns:oel="http://schemas.microsoft.com/office/2019/extlst" xmlns:r="http://schemas.openxmlformats.org/officeDocument/2006/relationships" xmlns:m="http://schemas.openxmlformats.org/officeDocument/2006/math" xmlns:v="urn:schemas-microsoft-com:vml" xmlns:wp14="http://schemas.microsoft.com/office/word/2010/wordprocessingDrawing" xmlns:wp="http://schemas.openxmlformats.org/drawingml/2006/wordprocessingDrawing" xmlns:w10="urn:schemas-microsoft-com:office:word" xmlns:w="http://schemas.openxmlformats.org/wordprocessingml/2006/main" xmlns:w14="http://schemas.microsoft.com/office/word/2010/wordml" xmlns:w15="http://schemas.microsoft.com/office/word/2012/wordml" xmlns:w16cex="http://schemas.microsoft.com/office/word/2018/wordml/cex" xmlns:w16cid="http://schemas.microsoft.com/office/word/2016/wordml/cid" xmlns:w16="http://schemas.microsoft.com/office/word/2018/wordml" xmlns:w16du="http://schemas.microsoft.com/office/word/2023/wordml/word16du" xmlns:w16sdtdh="http://schemas.microsoft.com/office/word/2020/wordml/sdtdatahash" xmlns:w16sdtfl="http://schemas.microsoft.com/office/word/2024/wordml/sdtformatlock" xmlns:w16se="http://schemas.microsoft.com/office/word/2015/wordml/symex" xmlns:wpg="http://schemas.microsoft.com/office/word/2010/wordprocessingGroup" xmlns:wpi="http://schemas.microsoft.com/office/word/2010/wordprocessingInk" xmlns:wne="http://schemas.microsoft.com/office/word/2006/wordml" xmlns:wps="http://schemas.microsoft.com/office/word/2010/wordprocessingShape" mc:Ignorable="w14 w15 w16se w16cid w16 w16cex w16sdtdh w16sdtfl w16du wp14"><w:body><w:p><w:pPr><w:tabs><w:tab w:val="left" w:pos="4253"/><w:tab w:val="left" w:pos="4536"/></w:tabs><w:spacing w:before="240" w:after="0" w:line="240" w:lineRule="auto"/><w:rPr><w:rFonts w:ascii="DB ChuanPim PSU Light" w:hAnsi="DB ChuanPim PSU Light" w:cs="DB ChuanPim PSU Light"/><w:sz w:val="58"/><w:szCs w:val="58"/></w:rPr></w:pPr><w:r><w:rPr><w:rFonts w:ascii="DB ChuanPim PSU Light" w:hAnsi="DB ChuanPim PSU Light" w:cs="DB ChuanPim PSU Light"/><w:noProof/><w:sz w:val="40"/><w:szCs w:val="40"/><w:cs/></w:rPr><mc:AlternateContent><mc:Choice Requires="wps"><w:drawing><wp:anchor distT="45720" distB="45720" distL="114300" distR="114300" simplePos="0" relativeHeight="251659264" behindDoc="0" locked="0" layoutInCell="1" allowOverlap="1" wp14:anchorId="54EA290E" wp14:editId="0E3F5D09"><wp:simplePos x="0" y="0"/><wp:positionH relativeFrom="column"><wp:posOffset>635</wp:posOffset></wp:positionH><wp:positionV relativeFrom="paragraph"><wp:posOffset>55880</wp:posOffset></wp:positionV><wp:extent cx="711835" cy="619760"/><wp:effectExtent l="0" t="0" r="0" b="8890"/><wp:wrapSquare wrapText="bothSides"/><wp:docPr id="217" name="กล่องข้อความ 2"/><wp:cNvGraphicFramePr><a:graphicFrameLocks xmlns:a="http://schemas.openxmlformats.org/drawingml/2006/main"/></wp:cNvGraphicFramePr><a:graphic xmlns:a="http://schemas.openxmlformats.org/drawingml/2006/main"><a:graphicData uri="http://schemas.microsoft.com/office/word/2010/wordprocessingShape"><wps:wsp><wps:cNvSpPr txBox="1"><a:spLocks noChangeArrowheads="1"/></wps:cNvSpPr><wps:spPr bwMode="auto"><a:xfrm><a:off x="0" y="0"/><a:ext cx="711835" cy="619760"/></a:xfrm><a:prstGeom prst="rect"><a:avLst/></a:prstGeom><a:solidFill><a:srgbClr val="FFFFFF"/></a:solidFill><a:ln w="9525"><a:noFill/><a:miter lim="800000"/><a:headEnd/><a:tailEnd/></a:ln></wps:spPr><wps:txbx><w:txbxContent><w:p><w:r><w:rPr><w:noProof/></w:rPr><w:drawing><wp:inline distT="0" distB="0" distL="0" distR="0" wp14:anchorId="3DABE8A4" wp14:editId="3ABA2E1A"><wp:extent cx="520065" cy="520065"/><wp:effectExtent l="0" t="0" r="0" b="0"/><wp:docPr id="2" name="รูปภาพ 2"/><wp:cNvGraphicFramePr><a:graphicFrameLocks xmlns:a="http://schemas.openxmlformats.org/drawingml/2006/main" noChangeAspect="1"/></wp:cNvGraphicFramePr><a:graphic xmlns:a="http://schemas.openxmlformats.org/drawingml/2006/main"><a:graphicData uri="http://schemas.openxmlformats.org/drawingml/2006/picture"><pic:pic xmlns:pic="http://schemas.openxmlformats.org/drawingml/2006/picture"><pic:nvPicPr><pic:cNvPr id="2" name="รูปภาพ 2"/><pic:cNvPicPr/></pic:nvPicPr><pic:blipFill><a:blip r:embed="rId12"><a:extLst><a:ext uri="{28A0092B-C50C-407E-A947-70E740481C1C}"><a14:useLocalDpi xmlns:a14="http://schemas.microsoft.com/office/drawing/2010/main" val="0"/></a:ext></a:extLst></a:blip><a:stretch><a:fillRect/></a:stretch></pic:blipFill><pic:spPr><a:xfrm><a:off x="0" y="0"/><a:ext cx="520065" cy="520065"/></a:xfrm><a:prstGeom prst="rect"><a:avLst/></a:prstGeom></pic:spPr></pic:pic></a:graphicData></a:graphic></wp:inline></w:drawing></w:r></w:p><w:p><w:r><w:rPr><w:noProof/></w:rPr><w:drawing><wp:inline distT="0" distB="0" distL="0" distR="0" wp14:anchorId="3DABE8A4" wp14:editId="3ABA2E1A"><wp:extent cx="520065" cy="520065"/><wp:effectExtent l="0" t="0" r="0" b="0"/><wp:docPr id="2" name="รูปภาพ 2"/><wp:cNvGraphicFramePr><a:graphicFrameLocks xmlns:a="http://schemas.openxmlformats.org/drawingml/2006/main" noChangeAspect="1"/></wp:cNvGraphicFramePr><a:graphic xmlns:a="http://schemas.openxmlformats.org/drawingml/2006/main"><a:graphicData uri="http://schemas.openxmlformats.org/drawingml/2006/picture"><pic:pic xmlns:pic="http://schemas.openxmlformats.org/drawingml/2006/picture"><pic:nvPicPr><pic:cNvPr id="2" name="รูปภาพ 2"/><pic:cNvPicPr/></pic:nvPicPr><pic:blipFill><a:blip r:embed="rId12"><a:extLst><a:ext uri="{28A0092B-C50C-407E-A947-70E740481C1C}"><a14:useLocalDpi xmlns:a14="http://schemas.microsoft.com/office/drawing/2010/main" val="0"/></a:ext></a:extLst></a:blip><a:stretch><a:fillRect/></a:stretch></pic:blipFill><pic:spPr><a:xfrm><a:off x="0" y="0"/><a:ext cx="520065" cy="520065"/></a:xfrm><a:prstGeom prst="rect"><a:avLst/></a:prstGeom></pic:spPr></pic:pic></a:graphicData></a:graphic></wp:inline></w:drawing></w:r></w:p><w:p><w:pPr><w:tabs><w:tab w:val="left" w:pos="4253"/><w:tab w:val="left" w:pos="4536"/></w:tabs><w:spacing w:after="0" w:line="240" w:lineRule="auto"/><w:rPr><w:rFonts w:ascii="DB ChuanPim PSU Light" w:hAnsi="DB ChuanPim PSU Light" w:cs="DB ChuanPim PSU Light"/><w:sz w:val="32"/><w:szCs w:val="32"/></w:rPr></w:pPr></w:p><w:p><w:pPr><w:tabs><w:tab w:val="left" w:pos="4253"/><w:tab w:val="left" w:pos="4536"/></w:tabs><w:spacing w:after="0" w:line="240" w:lineRule="auto"/><w:rPr><w:rFonts w:ascii="DB ChuanPim PSU Light" w:hAnsi="DB ChuanPim PSU Light" w:cs="DB ChuanPim PSU Light"/><w:sz w:val="32"/><w:szCs w:val="32"/><w:cs/></w:rPr></w:pPr><w:r><w:rPr><w:rFonts w:ascii="DB ChuanPim PSU Light" w:hAnsi="DB ChuanPim PSU Light" w:cs="DB ChuanPim PSU Light"/><w:sz w:val="32"/><w:szCs w:val="32"/><w:cs/></w:rPr><w:t xml:space="preserve">ส่วนราชการ</w:t></w:r><w:r><w:rPr><w:rFonts w:ascii="DB ChuanPim PSU Light" w:hAnsi="DB ChuanPim PSU Light" w:cs="DB ChuanPim PSU Light"/><w:sz w:val="32"/><w:szCs w:val="32"/><w:cs/></w:rPr><w:t xml:space="preserve">  {{ฝ่าย}}</w:t></w:r><w:r><w:rPr><w:rFonts w:ascii="DB ChuanPim PSU Light" w:hAnsi="DB ChuanPim PSU Light" w:cs="DB ChuanPim PSU Light"/><w:sz w:val="32"/><w:szCs w:val="32"/><w:cs/></w:rPr><w:br/></w:r><w:r><w:rPr><w:rFonts w:ascii="DB ChuanPim PSU Light" w:hAnsi="DB ChuanPim PSU Light" w:cs="DB ChuanPim PSU Light"/><w:sz w:val="32"/><w:szCs w:val="32"/><w:cs/></w:rPr><w:t xml:space="preserve">ที่</w:t></w:r><w:r><w:rPr><w:rFonts w:ascii="DB ChuanPim PSU Light" w:hAnsi="DB ChuanPim PSU Light" w:cs="DB ChuanPim PSU Light"/><w:sz w:val="32"/><w:szCs w:val="32"/><w:cs/></w:rPr><w:t xml:space="preserve">  {{เลขที่}}</w:t></w:r><w:r><w:rPr><w:rFonts w:ascii="DB ChuanPim PSU Light" w:hAnsi="DB ChuanPim PSU Light" w:cs="DB ChuanPim PSU Light"/><w:sz w:val="32"/><w:szCs w:val="32"/><w:cs/></w:rPr><w:t xml:space="preserve">                                             </w:t></w:r><w:r><w:rPr><w:rFonts w:ascii="DB ChuanPim PSU Light" w:hAnsi="DB ChuanPim PSU Light" w:cs="DB ChuanPim PSU Light"/><w:sz w:val="32"/><w:szCs w:val="32"/><w:cs/></w:rPr><w:t xml:space="preserve">วันที่</w:t></w:r><w:r><w:rPr><w:rFonts w:ascii="DB ChuanPim PSU Light" w:hAnsi="DB ChuanPim PSU Light" w:cs="DB ChuanPim PSU Light"/><w:sz w:val="32"/><w:szCs w:val="32"/><w:cs/></w:rPr><w:t xml:space="preserve">  {{วันที่}}</w:t></w:r></w:p><w:p><w:pPr><w:tabs><w:tab w:val="left" w:pos="450"/><w:tab w:val="left" w:pos="567"/><w:tab w:val="left" w:pos="993"/><w:tab w:val="left" w:pos="4536"/></w:tabs><w:spacing w:after="0" w:line="276" w:lineRule="auto"/><w:ind w:left="450" w:hanging="450"/><w:rPr><w:rFonts w:ascii="DB ChuanPim PSU Light" w:hAnsi="DB ChuanPim PSU Light" w:cs="DB ChuanPim PSU Light"/><w:sz w:val="32"/><w:szCs w:val="32"/></w:rPr></w:pPr><w:r><w:rPr><w:rFonts w:ascii="DB ChuanPim PSU Light" w:hAnsi="DB ChuanPim PSU Light" w:cs="DB ChuanPim PSU Light"/><w:sz w:val="32"/><w:szCs w:val="32"/><w:cs/></w:rPr><w:t xml:space="preserve">เรื่อง</w:t></w:r><w:r><w:rPr><w:rFonts w:ascii="DB ChuanPim PSU Light" w:hAnsi="DB ChuanPim PSU Light" w:cs="DB ChuanPim PSU Light"/><w:sz w:val="32"/><w:szCs w:val="32"/><w:cs/></w:rPr><w:t xml:space="preserve">  {{เรื่อง}}</w:t></w:r></w:p><w:p><w:pPr><w:tabs><w:tab w:val="left" w:pos="450"/><w:tab w:val="left" w:pos="567"/><w:tab w:val="left" w:pos="993"/><w:tab w:val="left" w:pos="4536"/></w:tabs><w:spacing w:after="0" w:line="276" w:lineRule="auto"/><w:ind w:left="450" w:hanging="450"/><w:rPr><w:rFonts w:ascii="DB ChuanPim PSU Light" w:hAnsi="DB ChuanPim PSU Light" w:cs="DB ChuanPim PSU Light"/><w:sz w:val="10"/><w:szCs w:val="10"/></w:rPr></w:pPr><w:r><w:rPr><w:rFonts w:ascii="DB ChuanPim PSU Light" w:hAnsi="DB ChuanPim PSU Light" w:cs="DB ChuanPim PSU Light"/><w:noProof/><w:sz w:val="31"/><w:szCs w:val="31"/><w:lang w:val="th-TH"/></w:rPr><mc:AlternateContent><mc:Choice Requires="wps"><w:drawing><wp:anchor distT="0" distB="0" distL="114300" distR="114300" simplePos="0" relativeHeight="251668480" behindDoc="0" locked="0" layoutInCell="1" allowOverlap="1" wp14:anchorId="3CCAD426" wp14:editId="4C39830E"><wp:simplePos x="0" y="0"/><wp:positionH relativeFrom="margin"><wp:posOffset>0</wp:posOffset></wp:positionH><wp:positionV relativeFrom="paragraph"><wp:posOffset>-635</wp:posOffset></wp:positionV><wp:extent cx="5781675" cy="0"/><wp:effectExtent l="0" t="0" r="0" b="0"/><wp:wrapNone/><wp:docPr id="3" name="ตัวเชื่อมต่อตรง 3"/><wp:cNvGraphicFramePr/><a:graphic xmlns:a="http://schemas.openxmlformats.org/drawingml/2006/main"><a:graphicData uri="http://schemas.microsoft.com/office/word/2010/wordprocessingShape"><wps:wsp><wps:cNvCnPr/><wps:spPr><a:xfrm><a:off x="0" y="0"/><a:ext cx="5781675" cy="0"/></a:xfrm><a:prstGeom prst="line"><a:avLst/></a:prstGeom><a:noFill/><a:ln w="6350" cap="flat" cmpd="sng" algn="ctr"><a:solidFill><a:sysClr val="windowText" lastClr="000000"/></a:solidFill><a:prstDash val="solid"/><a:miter lim="800000"/></a:ln><a:effectLst/></wps:spPr><wps:bodyPr/></wps:wsp></a:graphicData></a:graphic><wp14:sizeRelH relativeFrom="margin"><wp14:pctWidth>0</wp14:pctWidth></wp14:sizeRelH></wp:anchor></w:drawing></mc:Choice><mc:Fallback><w:pict><v:line w14:anchorId="30C89AFB" id="ตัวเชื่อมต่อตรง 3" o:spid="_x0000_s1026" style="position:absolute;z-index:251668480;visibility:visible;mso-wrap-style:square;mso-width-percent:0;mso-wrap-distance-left:9pt;mso-wrap-distance-top:0;mso-wrap-distance-right:9pt;mso-wrap-distance-bottom:0;mso-position-horizontal:absolute;mso-position-horizontal-relative:margin;mso-position-vertical:absolute;mso-position-vertical-relative:text;mso-width-percent:0;mso-width-relative:margin" from="0,-.05pt" to="455.25pt,-.05pt" o:gfxdata="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" strokecolor="windowText" strokeweight=".5pt"><v:stroke joinstyle="miter"/><w10:wrap anchorx="margin"/></v:line></w:pict></mc:Fallback></mc:AlternateContent></w:r></w:p><w:p><w:pPr><w:tabs><w:tab w:val="left" w:pos="450"/><w:tab w:val="left" w:pos="567"/><w:tab w:val="left" w:pos="993"/><w:tab w:val="left" w:pos="4536"/></w:tabs><w:spacing w:after="0" w:line="276" w:lineRule="auto"/><w:ind w:left="450" w:hanging="450"/><w:rPr><w:rFonts w:ascii="DB ChuanPim PSU Light" w:hAnsi="DB ChuanPim PSU Light" w:cs="DB ChuanPim PSU Light"/><w:sz w:val="32"/><w:szCs w:val="32"/></w:rPr></w:pPr><w:r><w:rPr><w:rFonts w:ascii="DB ChuanPim PSU Light" w:hAnsi="DB ChuanPim PSU Light" w:cs="DB ChuanPim PSU Light"/><w:sz w:val="32"/><w:szCs w:val="32"/><w:cs/></w:rPr><w:t xml:space="preserve">เรียน</w:t></w:r><w:r><w:rPr><w:rFonts w:ascii="DB ChuanPim PSU Light" w:hAnsi="DB ChuanPim PSU Light" w:cs="DB ChuanPim PSU Light"/><w:sz w:val="32"/><w:szCs w:val="32"/><w:cs/></w:rPr><w:t xml:space="preserve">  {{เรียน}}</w:t></w:r></w:p><w:p><w:pPr><w:spacing w:after="0" w:line="240" w:lineRule="auto"/><w:ind w:firstLine="1440"/><w:jc w:val="thaiDistribute"/><w:rPr><w:rFonts w:ascii="DB ChuanPim PSU Light" w:hAnsi="DB ChuanPim PSU Light" w:cs="DB ChuanPim PSU Light"/><w:sz w:val="10"/><w:szCs w:val="10"/></w:rPr></w:pPr></w:p><w:p><w:pPr><w:pStyle w:val="a3"/><w:spacing w:before="240"/><w:ind w:firstLine="1418"/><w:jc w:val="thaiDistribute"/><w:rPr><w:rStyle w:val="rse6dlih"/><w:rFonts w:ascii="DB ChuanPim PSU Light" w:hAnsi="DB ChuanPim PSU Light" w:cs="DB ChuanPim PSU Light"/><w:color w:val="000000"/><w:cs/></w:rPr></w:pPr><w:r><w:rPr><w:rFonts w:ascii="DB ChuanPim PSU Light" w:hAnsi="DB ChuanPim PSU Light" w:cs="DB ChuanPim PSU Light"/></w:rPr><w:t>{{</w:t></w:r><w:r><w:rPr><w:rFonts w:ascii="DB ChuanPim PSU Light" w:hAnsi="DB ChuanPim PSU Light" w:cs="DB ChuanPim PSU Light" w:hint="cs"/><w:cs/></w:rPr><w:t>ภาคเหตุ</w:t></w:r><w:r><w:rPr><w:rFonts w:ascii="DB ChuanPim PSU Light" w:hAnsi="DB ChuanPim PSU Light" w:cs="DB ChuanPim PSU Light"/></w:rPr><w:t>}}</w:t></w:r></w:p><w:p><w:pPr><w:pStyle w:val="a3"/><w:spacing w:before="240"/><w:ind w:firstLine="1418"/><w:jc w:val="thaiDistribute"/><w:rPr><w:rFonts w:ascii="DB ChuanPim PSU Light" w:hAnsi="DB ChuanPim PSU Light" w:cs="DB ChuanPim PSU Light"/></w:rPr></w:pPr><w:r><w:rPr><w:rFonts w:ascii="DB ChuanPim PSU Light" w:hAnsi="DB ChuanPim PSU Light" w:cs="DB ChuanPim PSU Light"/></w:rPr><w:t>{{</w:t></w:r><w:r><w:rPr><w:rFonts w:ascii="DB ChuanPim PSU Light" w:hAnsi="DB ChuanPim PSU Light" w:cs="DB ChuanPim PSU Light" w:hint="cs"/><w:cs/></w:rPr><w:t>ภาคความประสงค์</w:t></w:r><w:r><w:rPr><w:rFonts w:ascii="DB ChuanPim PSU Light" w:hAnsi="DB ChuanPim PSU Light" w:cs="DB ChuanPim PSU Light"/></w:rPr><w:t>}}</w:t></w:r></w:p><w:p><w:pPr><w:pStyle w:val="a3"/><w:spacing w:before="240"/><w:ind w:firstLine="1418"/><w:jc w:val="thaiDistribute"/><w:rPr><w:rFonts w:ascii="DB ChuanPim PSU Light" w:hAnsi="DB ChuanPim PSU Light" w:cs="DB ChuanPim PSU Light"/><w:color w:val="000000"/></w:rPr></w:pPr><w:r><w:rPr><w:rFonts w:ascii="DB ChuanPim PSU Light" w:hAnsi="DB ChuanPim PSU Light" w:cs="DB ChuanPim PSU Light"/></w:rPr><w:t>{{</w:t></w:r><w:r><w:rPr><w:rFonts w:ascii="DB ChuanPim PSU Light" w:hAnsi="DB ChuanPim PSU Light" w:cs="DB ChuanPim PSU Light" w:hint="cs"/><w:cs/></w:rPr><w:t>ภาคสรุป</w:t></w:r><w:r><w:rPr><w:rFonts w:ascii="DB ChuanPim PSU Light" w:hAnsi="DB ChuanPim PSU Light" w:cs="DB ChuanPim PSU Light"/></w:rPr><w:t>}}</w:t></w:r></w:p><w:p><w:pPr><w:rPr><w:rFonts w:ascii="DB ChuanPim PSU Light" w:hAnsi="DB ChuanPim PSU Light" w:cs="DB ChuanPim PSU Light"/><w:sz w:val="32"/><w:szCs w:val="32"/></w:rPr></w:pPr><w:bookmarkStart w:id="2" w:name="_Hlk196728221"/></w:p><w:p><w:pPr><w:ind w:left="360" w:firstLine="1058"/><w:rPr><w:rFonts w:ascii="DB ChuanPim PSU Light" w:hAnsi="DB ChuanPim PSU Light" w:cs="DB ChuanPim PSU Light"/><w:sz w:val="32"/><w:szCs w:val="32"/></w:rPr></w:pPr><w:r><w:rPr><w:rFonts w:ascii="DB ChuanPim PSU Light" w:hAnsi="DB ChuanPim PSU Light" w:cs="DB ChuanPim PSU Light"/><w:sz w:val="32"/><w:szCs w:val="32"/></w:rPr><w:t>{{</w:t></w:r><w:r><w:rPr><w:rFonts w:ascii="DB ChuanPim PSU Light" w:hAnsi="DB ChuanPim PSU Light" w:cs="DB ChuanPim PSU Light"/><w:sz w:val="32"/><w:szCs w:val="32"/><w:cs/></w:rPr><w:t>จึงเรียนมาเพื่อ</w:t></w:r><w:r><w:rPr><w:rFonts w:ascii="DB ChuanPim PSU Light" w:hAnsi="DB ChuanPim PSU Light" w:cs="DB ChuanPim PSU Light" w:hint="cs"/><w:sz w:val="32"/><w:szCs w:val="32"/><w:cs/></w:rPr><w:t>...</w:t></w:r><w:r><w:rPr><w:rFonts w:ascii="DB ChuanPim PSU Light" w:hAnsi="DB ChuanPim PSU Light" w:cs="DB ChuanPim PSU Light"/><w:sz w:val="32"/><w:szCs w:val="32"/></w:rPr><w:t>}}</w:t></w:r><w:r><w:rPr><w:rFonts w:ascii="DB ChuanPim PSU Light" w:hAnsi="DB ChuanPim PSU Light" w:cs="DB ChuanPim PSU Light"/><w:sz w:val="32"/><w:szCs w:val="32"/><w:cs/></w:rPr><w:t xml:space="preserve"> </w:t></w:r></w:p><w:p><w:pPr><w:ind w:left="360" w:firstLine="720"/><w:rPr><w:rFonts w:ascii="DB ChuanPim PSU Light" w:hAnsi="DB ChuanPim PSU Light" w:cs="DB ChuanPim PSU Light"/><w:sz w:val="32"/><w:szCs w:val="32"/></w:rPr></w:pPr></w:p><w:p><w:pPr><w:spacing w:before="240"/><w:rPr><w:rFonts w:ascii="DB ChuanPim PSU Light" w:hAnsi="DB ChuanPim PSU Light" w:cs="DB ChuanPim PSU Light"/><w:sz w:val="32"/><w:szCs w:val="32"/></w:rPr></w:pPr></w:p><w:p><w:pPr><w:rPr><w:rFonts w:ascii="DB ChuanPim PSU Light" w:hAnsi="DB ChuanPim PSU Light" w:cs="DB ChuanPim PSU Light"/><w:sz w:val="32"/><w:szCs w:val="32"/></w:rPr></w:pPr><w:r><w:rPr><w:rFonts w:ascii="DB ChuanPim PSU Light" w:hAnsi="DB ChuanPim PSU Light" w:cs="DB ChuanPim PSU Light"/><w:sz w:val="32"/><w:szCs w:val="32"/></w:rPr><w:t xml:space="preserve">    </w:t></w:r><w:r><w:rPr><w:rFonts w:ascii="DB ChuanPim PSU Light" w:hAnsi="DB ChuanPim PSU Light" w:cs="DB ChuanPim PSU Light"/><w:sz w:val="32"/><w:szCs w:val="32"/></w:rPr><w:tab/></w:r><w:r><w:rPr><w:rFonts w:ascii="DB ChuanPim PSU Light" w:hAnsi="DB ChuanPim PSU Light" w:cs="DB ChuanPim PSU Light"/><w:sz w:val="32"/><w:szCs w:val="32"/></w:rPr><w:tab/></w:r><w:r><w:rPr><w:rFonts w:ascii="DB ChuanPim PSU Light" w:hAnsi="DB ChuanPim PSU Light" w:cs="DB ChuanPim PSU Light"/><w:sz w:val="32"/><w:szCs w:val="32"/></w:rPr><w:tab/></w:r><w:r><w:rPr><w:rFonts w:ascii="DB ChuanPim PSU Light" w:hAnsi="DB ChuanPim PSU Light" w:cs="DB ChuanPim PSU Light"/><w:sz w:val="32"/><w:szCs w:val="32"/><w:cs/></w:rPr><w:tab/></w:r><w:r><w:rPr><w:rFonts w:ascii="DB ChuanPim PSU Light" w:hAnsi="DB ChuanPim PSU Light" w:cs="DB ChuanPim PSU Light"/><w:sz w:val="32"/><w:szCs w:val="32"/><w:cs/></w:rPr><w:tab/></w:r><w:r><w:rPr><w:rFonts w:ascii="DB ChuanPim PSU Light" w:hAnsi="DB ChuanPim PSU Light" w:cs="DB ChuanPim PSU Light"/><w:sz w:val="32"/><w:szCs w:val="32"/><w:cs/></w:rPr><w:tab/></w:r><w:r><w:rPr><w:rFonts w:ascii="DB ChuanPim PSU Light" w:hAnsi="DB ChuanPim PSU Light" w:cs="DB ChuanPim PSU Light"/><w:sz w:val="32"/><w:szCs w:val="32"/><w:cs/></w:rPr><w:tab/><w:t>(</w:t></w:r><w:r><w:rPr><w:rFonts w:ascii="DB ChuanPim PSU Light" w:hAnsi="DB ChuanPim PSU Light" w:cs="DB ChuanPim PSU Light"/><w:sz w:val="32"/><w:szCs w:val="32"/></w:rPr><w:t>{{</w:t></w:r><w:r><w:rPr><w:rFonts w:ascii="DB ChuanPim PSU Light" w:hAnsi="DB ChuanPim PSU Light" w:cs="DB ChuanPim PSU Light" w:hint="cs"/><w:sz w:val="32"/><w:szCs w:val="32"/><w:cs/></w:rPr><w:t>ลงชื่อ</w:t></w:r><w:r><w:rPr><w:rFonts w:ascii="DB ChuanPim PSU Light" w:hAnsi="DB ChuanPim PSU Light" w:cs="DB ChuanPim PSU Light"/><w:sz w:val="32"/><w:szCs w:val="32"/></w:rPr><w:t>1}}</w:t></w:r><w:r><w:rPr><w:rFonts w:ascii="DB ChuanPim PSU Light" w:hAnsi="DB ChuanPim PSU Light" w:cs="DB ChuanPim PSU Light"/><w:sz w:val="32"/><w:szCs w:val="32"/><w:cs/></w:rPr><w:t>)</w:t></w:r><w:r><w:rPr><w:rFonts w:ascii="DB ChuanPim PSU Light" w:hAnsi="DB ChuanPim PSU Light" w:cs="DB ChuanPim PSU Light"/><w:sz w:val="32"/><w:szCs w:val="32"/></w:rPr><w:tab/></w:r><w:r><w:rPr><w:rFonts w:ascii="DB ChuanPim PSU Light" w:hAnsi="DB ChuanPim PSU Light" w:cs="DB ChuanPim PSU Light"/><w:sz w:val="32"/><w:szCs w:val="32"/></w:rPr><w:tab/></w:r><w:r><w:rPr><w:rFonts w:ascii="DB ChuanPim PSU Light" w:hAnsi="DB ChuanPim PSU Light" w:cs="DB ChuanPim PSU Light"/><w:sz w:val="32"/><w:szCs w:val="32"/></w:rPr><w:tab/></w:r><w:r><w:rPr><w:rFonts w:ascii="DB ChuanPim PSU Light" w:hAnsi="DB ChuanPim PSU Light" w:cs="DB ChuanPim PSU Light"/><w:sz w:val="32"/><w:szCs w:val="32"/></w:rPr><w:tab/></w:r><w:r><w:rPr><w:rFonts w:ascii="DB ChuanPim PSU Light" w:hAnsi="DB ChuanPim PSU Light" w:cs="DB ChuanPim PSU Light"/><w:sz w:val="32"/><w:szCs w:val="32"/></w:rPr><w:tab/></w:r><w:r><w:rPr><w:rFonts w:ascii="DB ChuanPim PSU Light" w:hAnsi="DB ChuanPim PSU Light" w:cs="DB ChuanPim PSU Light"/><w:sz w:val="32"/><w:szCs w:val="32"/></w:rPr><w:tab/></w:r><w:r><w:rPr><w:rFonts w:ascii="DB ChuanPim PSU Light" w:hAnsi="DB ChuanPim PSU Light" w:cs="DB ChuanPim PSU Light"/><w:sz w:val="32"/><w:szCs w:val="32"/></w:rPr><w:tab/></w:r><w:r><w:rPr><w:rFonts w:ascii="DB ChuanPim PSU Light" w:hAnsi="DB ChuanPim PSU Light" w:cs="DB ChuanPim PSU Light"/><w:sz w:val="32"/><w:szCs w:val="32"/></w:rPr><w:tab/></w:r><w:r><w:rPr><w:rFonts w:ascii="DB ChuanPim PSU Light" w:hAnsi="DB ChuanPim PSU Light" w:cs="DB ChuanPim PSU Light"/><w:sz w:val="32"/><w:szCs w:val="32"/><w:cs/></w:rPr><w:t xml:space="preserve">     </w:t></w:r><w:r><w:rPr><w:rFonts w:ascii="DB ChuanPim PSU Light" w:hAnsi="DB ChuanPim PSU Light" w:cs="DB ChuanPim PSU Light" w:hint="cs"/><w:sz w:val="32"/><w:szCs w:val="32"/><w:cs/></w:rPr><w:t xml:space="preserve">  </w:t></w:r><w:r><w:rPr><w:rFonts w:ascii="DB ChuanPim PSU Light" w:hAnsi="DB ChuanPim PSU Light" w:cs="DB ChuanPim PSU Light"/><w:sz w:val="32"/><w:szCs w:val="32"/></w:rPr><w:t xml:space="preserve">                   {{</w:t></w:r><w:r><w:rPr><w:rFonts w:ascii="DB ChuanPim PSU Light" w:hAnsi="DB ChuanPim PSU Light" w:cs="DB ChuanPim PSU Light" w:hint="cs"/><w:sz w:val="32"/><w:szCs w:val="32"/><w:cs/></w:rPr><w:t>ตำแหน่ง</w:t></w:r><w:r><w:rPr><w:rFonts w:ascii="DB ChuanPim PSU Light" w:hAnsi="DB ChuanPim PSU Light" w:cs="DB ChuanPim PSU Light"/><w:sz w:val="32"/><w:szCs w:val="32"/></w:rPr><w:t>1}}</w:t></w:r></w:p><w:p><w:pPr><w:rPr><w:rFonts w:ascii="DB ChuanPim PSU Light" w:hAnsi="DB ChuanPim PSU Light" w:cs="DB ChuanPim PSU Light"/><w:sz w:val="32"/><w:szCs w:val="32"/></w:rPr></w:pPr><w:r><w:rPr><w:rFonts w:ascii="DB ChuanPim PSU Light" w:hAnsi="DB ChuanPim PSU Light" w:cs="DB ChuanPim PSU Light"/><w:sz w:val="32"/><w:szCs w:val="32"/><w:cs/></w:rPr><w:tab/></w:r><w:r><w:rPr><w:rFonts w:ascii="DB ChuanPim PSU Light" w:hAnsi="DB ChuanPim PSU Light" w:cs="DB ChuanPim PSU Light"/><w:sz w:val="32"/><w:szCs w:val="32"/><w:cs/></w:rPr><w:tab/></w:r><w:r><w:rPr><w:rFonts w:ascii="DB ChuanPim PSU Light" w:hAnsi="DB ChuanPim PSU Light" w:cs="DB ChuanPim PSU Light"/><w:sz w:val="32"/><w:szCs w:val="32"/><w:cs/></w:rPr><w:tab/></w:r><w:r><w:rPr><w:rFonts w:ascii="DB ChuanPim PSU Light" w:hAnsi="DB ChuanPim PSU Light" w:cs="DB ChuanPim PSU Light"/><w:sz w:val="32"/><w:szCs w:val="32"/><w:cs/></w:rPr><w:tab/></w:r><w:r><w:rPr><w:rFonts w:ascii="DB ChuanPim PSU Light" w:hAnsi="DB ChuanPim PSU Light" w:cs="DB ChuanPim PSU Light"/><w:sz w:val="32"/><w:szCs w:val="32"/><w:cs/></w:rPr><w:tab/></w:r><w:r><w:rPr><w:rFonts w:ascii="DB ChuanPim PSU Light" w:hAnsi="DB ChuanPim PSU Light" w:cs="DB ChuanPim PSU Light"/><w:sz w:val="32"/><w:szCs w:val="32"/></w:rPr><w:t xml:space="preserve">                   {{</w:t></w:r><w:r><w:rPr><w:rFonts w:ascii="DB ChuanPim PSU Light" w:hAnsi="DB ChuanPim PSU Light" w:cs="DB ChuanPim PSU Light" w:hint="cs"/><w:sz w:val="32"/><w:szCs w:val="32"/><w:cs/></w:rPr><w:t>วันที่</w:t></w:r><w:r><w:rPr><w:rFonts w:ascii="DB ChuanPim PSU Light" w:hAnsi="DB ChuanPim PSU Light" w:cs="DB ChuanPim PSU Light"/><w:sz w:val="32"/><w:szCs w:val="32"/></w:rPr><w:t>}}</w:t></w:r></w:p><w:p><w:pPr><w:rPr><w:rFonts w:ascii="DB ChuanPim PSU Light" w:hAnsi="DB ChuanPim PSU Light" w:cs="DB ChuanPim PSU Light"/><w:sz w:val="30"/><w:szCs w:val="30"/></w:rPr></w:pPr></w:p><w:p><w:pPr><w:ind w:left="3600" w:firstLine="720"/><w:rPr><w:rFonts w:ascii="DB ChuanPim PSU Light" w:hAnsi="DB ChuanPim PSU Light" w:cs="DB ChuanPim PSU Light"/><w:sz w:val="30"/><w:szCs w:val="30"/></w:rPr></w:pPr></w:p><w:p><w:pPr><w:ind w:left="4320"/><w:rPr><w:rFonts w:ascii="DB ChuanPim PSU Light" w:hAnsi="DB ChuanPim PSU Light" w:cs="DB ChuanPim PSU Light"/><w:sz w:val="32"/><w:szCs w:val="32"/></w:rPr></w:pPr><w:r><w:rPr><w:rFonts w:ascii="DB ChuanPim PSU Light" w:hAnsi="DB ChuanPim PSU Light" w:cs="DB ChuanPim PSU Light"/><w:sz w:val="32"/><w:szCs w:val="32"/></w:rPr><w:t xml:space="preserve">         </w:t></w:r><w:r><w:rPr><w:rFonts w:ascii="DB ChuanPim PSU Light" w:hAnsi="DB ChuanPim PSU Light" w:cs="DB ChuanPim PSU Light"/><w:sz w:val="32"/><w:szCs w:val="32"/><w:cs/></w:rPr><w:t>(</w:t></w:r><w:r><w:rPr><w:rFonts w:ascii="DB ChuanPim PSU Light" w:hAnsi="DB ChuanPim PSU Light" w:cs="DB ChuanPim PSU Light"/><w:sz w:val="32"/><w:szCs w:val="32"/></w:rPr><w:t>{{</w:t></w:r><w:r><w:rPr><w:rFonts w:ascii="DB ChuanPim PSU Light" w:hAnsi="DB ChuanPim PSU Light" w:cs="DB ChuanPim PSU Light" w:hint="cs"/><w:sz w:val="32"/><w:szCs w:val="32"/><w:cs/></w:rPr><w:t>ลงชื่อ2</w:t></w:r><w:r><w:rPr><w:rFonts w:ascii="DB ChuanPim PSU Light" w:hAnsi="DB ChuanPim PSU Light" w:cs="DB ChuanPim PSU Light"/><w:sz w:val="32"/><w:szCs w:val="32"/></w:rPr><w:t>}}</w:t></w:r><w:r><w:rPr><w:rFonts w:ascii="DB ChuanPim PSU Light" w:hAnsi="DB ChuanPim PSU Light" w:cs="DB ChuanPim PSU Light"/><w:sz w:val="32"/><w:szCs w:val="32"/><w:cs/></w:rPr><w:t>)</w:t></w:r><w:r><w:rPr><w:rFonts w:ascii="DB ChuanPim PSU Light" w:hAnsi="DB ChuanPim PSU Light" w:cs="DB ChuanPim PSU Light"/><w:sz w:val="32"/><w:szCs w:val="32"/></w:rPr><w:tab/></w:r></w:p><w:p><w:pPr><w:ind w:left="3600" w:firstLine="720"/><w:rPr><w:rFonts w:ascii="DB ChuanPim PSU Light" w:hAnsi="DB ChuanPim PSU Light" w:cs="DB ChuanPim PSU Light"/></w:rPr></w:pPr><w:r><w:rPr><w:rFonts w:ascii="DB ChuanPim PSU Light" w:hAnsi="DB ChuanPim PSU Light" w:cs="DB ChuanPim PSU Light"/><w:sz w:val="32"/><w:szCs w:val="32"/></w:rPr><w:t xml:space="preserve">        {{</w:t></w:r><w:r><w:rPr><w:rFonts w:ascii="DB ChuanPim PSU Light" w:hAnsi="DB ChuanPim PSU Light" w:cs="DB ChuanPim PSU Light" w:hint="cs"/><w:sz w:val="32"/><w:szCs w:val="32"/><w:cs/></w:rPr><w:t>ตำแหน่ง</w:t></w:r><w:r><w:rPr><w:rFonts w:ascii="DB ChuanPim PSU Light" w:hAnsi="DB ChuanPim PSU Light" w:cs="DB ChuanPim PSU Light"/><w:sz w:val="32"/><w:szCs w:val="32"/></w:rPr><w:t>2</w:t></w:r><w:r><w:rPr><w:rFonts w:ascii="DB ChuanPim PSU Light" w:hAnsi="DB ChuanPim PSU Light" w:cs="DB ChuanPim PSU Light"/><w:sz w:val="32"/><w:szCs w:val="32"/></w:rPr><w:t>}}</w:t></w:r><w:r><w:rPr><w:rFonts w:ascii="DB ChuanPim PSU Light" w:hAnsi="DB ChuanPim PSU Light" w:cs="DB ChuanPim PSU Light"/></w:rPr><w:t xml:space="preserve">           </w:t></w:r></w:p><w:p><w:pPr><w:rPr><w:rFonts w:ascii="DB ChuanPim PSU Light" w:hAnsi="DB ChuanPim PSU Light" w:cs="DB ChuanPim PSU Light"/><w:sz w:val="30"/><w:szCs w:val="30"/></w:rPr></w:pPr><w:r><w:rPr><w:rFonts w:ascii="DB ChuanPim PSU Light" w:hAnsi="DB ChuanPim PSU Light" w:cs="DB ChuanPim PSU Light"/></w:rPr><w:t xml:space="preserve">     </w:t></w:r><w:r><w:rPr><w:rFonts w:ascii="DB ChuanPim PSU Light" w:hAnsi="DB ChuanPim PSU Light" w:cs="DB ChuanPim PSU Light"/></w:rPr><w:tab/></w:r><w:r><w:rPr><w:rFonts w:ascii="DB ChuanPim PSU Light" w:hAnsi="DB ChuanPim PSU Light" w:cs="DB ChuanPim PSU Light"/></w:rPr><w:tab/></w:r><w:r><w:rPr><w:rFonts w:ascii="DB ChuanPim PSU Light" w:hAnsi="DB ChuanPim PSU Light" w:cs="DB ChuanPim PSU Light"/></w:rPr><w:tab/></w:r><w:r><w:rPr><w:rFonts w:ascii="DB ChuanPim PSU Light" w:hAnsi="DB ChuanPim PSU Light" w:cs="DB ChuanPim PSU Light"/></w:rPr><w:tab/></w:r><w:r><w:rPr><w:rFonts w:ascii="DB ChuanPim PSU Light" w:hAnsi="DB ChuanPim PSU Light" w:cs="DB ChuanPim PSU Light"/></w:rPr><w:tab/><w:t xml:space="preserve">      ……..……/……..……/…………..</w:t></w:r></w:p><w:p><w:pPr><w:rPr><w:rFonts w:ascii="DB ChuanPim PSU Light" w:hAnsi="DB ChuanPim PSU Light" w:cs="DB ChuanPim PSU Light"/><w:sz w:val="30"/><w:szCs w:val="30"/></w:rPr></w:pPr></w:p><w:p><w:pPr><w:ind w:left="3600" w:firstLine="720"/><w:rPr><w:rFonts w:ascii="DB ChuanPim PSU Light" w:hAnsi="DB ChuanPim PSU Light" w:cs="DB ChuanPim PSU Light"/><w:sz w:val="30"/><w:szCs w:val="30"/></w:rPr></w:pPr></w:p><w:p><w:pPr><w:ind w:left="4320"/><w:rPr><w:rFonts w:ascii="DB ChuanPim PSU Light" w:hAnsi="DB ChuanPim PSU Light" w:cs="DB ChuanPim PSU Light"/><w:sz w:val="32"/><w:szCs w:val="32"/></w:rPr></w:pPr><w:r><w:rPr><w:rFonts w:ascii="DB ChuanPim PSU Light" w:hAnsi="DB ChuanPim PSU Light" w:cs="DB ChuanPim PSU Light"/><w:sz w:val="32"/><w:szCs w:val="32"/></w:rPr><w:t xml:space="preserve">         </w:t></w:r><w:r><w:rPr><w:rFonts w:ascii="DB ChuanPim PSU Light" w:hAnsi="DB ChuanPim PSU Light" w:cs="DB ChuanPim PSU Light"/><w:sz w:val="32"/><w:szCs w:val="32"/><w:cs/></w:rPr><w:t>(</w:t></w:r><w:r><w:rPr><w:rFonts w:ascii="DB ChuanPim PSU Light" w:hAnsi="DB ChuanPim PSU Light" w:cs="DB ChuanPim PSU Light"/><w:sz w:val="32"/><w:szCs w:val="32"/></w:rPr><w:t>{{</w:t></w:r><w:r><w:rPr><w:rFonts w:ascii="DB ChuanPim PSU Light" w:hAnsi="DB ChuanPim PSU Light" w:cs="DB ChuanPim PSU Light" w:hint="cs"/><w:sz w:val="32"/><w:szCs w:val="32"/><w:cs/></w:rPr><w:t>ลงชื่อ</w:t></w:r><w:r><w:rPr><w:rFonts w:ascii="DB ChuanPim PSU Light" w:hAnsi="DB ChuanPim PSU Light" w:cs="DB ChuanPim PSU Light"/><w:sz w:val="32"/><w:szCs w:val="32"/></w:rPr><w:t>3</w:t></w:r><w:r><w:rPr><w:rFonts w:ascii="DB ChuanPim PSU Light" w:hAnsi="DB ChuanPim PSU Light" w:cs="DB ChuanPim PSU Light"/><w:sz w:val="32"/><w:szCs w:val="32"/></w:rPr><w:t>}}</w:t></w:r><w:r><w:rPr><w:rFonts w:ascii="DB ChuanPim PSU Light" w:hAnsi="DB ChuanPim PSU Light" w:cs="DB ChuanPim PSU Light"/><w:sz w:val="32"/><w:szCs w:val="32"/><w:cs/></w:rPr><w:t>)</w:t></w:r><w:r><w:rPr><w:rFonts w:ascii="DB ChuanPim PSU Light" w:hAnsi="DB ChuanPim PSU Light" w:cs="DB ChuanPim PSU Light"/><w:sz w:val="32"/><w:szCs w:val="32"/></w:rPr><w:tab/></w:r></w:p><w:p><w:pPr><w:ind w:left="3600" w:firstLine="720"/><w:rPr><w:rFonts w:ascii="DB ChuanPim PSU Light" w:hAnsi="DB ChuanPim PSU Light" w:cs="DB ChuanPim PSU Light"/></w:rPr></w:pPr><w:r><w:rPr><w:rFonts w:ascii="DB ChuanPim PSU Light" w:hAnsi="DB ChuanPim PSU Light" w:cs="DB ChuanPim PSU Light"/><w:sz w:val="32"/><w:szCs w:val="32"/></w:rPr><w:t xml:space="preserve">        {{</w:t></w:r><w:r><w:rPr><w:rFonts w:ascii="DB ChuanPim PSU Light" w:hAnsi="DB ChuanPim PSU Light" w:cs="DB ChuanPim PSU Light" w:hint="cs"/><w:sz w:val="32"/><w:szCs w:val="32"/><w:cs/></w:rPr><w:t>ตำแหน่ง</w:t></w:r><w:r><w:rPr><w:rFonts w:ascii="DB ChuanPim PSU Light" w:hAnsi="DB ChuanPim PSU Light" w:cs="DB ChuanPim PSU Light"/><w:sz w:val="32"/><w:szCs w:val="32"/></w:rPr><w:t>3</w:t></w:r><w:r><w:rPr><w:rFonts w:ascii="DB ChuanPim PSU Light" w:hAnsi="DB ChuanPim PSU Light" w:cs="DB ChuanPim PSU Light"/><w:sz w:val="32"/><w:szCs w:val="32"/></w:rPr><w:t>}}</w:t></w:r><w:r><w:rPr><w:rFonts w:ascii="DB ChuanPim PSU Light" w:hAnsi="DB ChuanPim PSU Light" w:cs="DB ChuanPim PSU Light"/></w:rPr><w:t xml:space="preserve">           </w:t></w:r></w:p><w:p><w:pPr><w:rPr><w:rFonts w:ascii="DB ChuanPim PSU Light" w:hAnsi="DB ChuanPim PSU Light" w:cs="DB ChuanPim PSU Light"/><w:sz w:val="30"/><w:szCs w:val="30"/></w:rPr></w:pPr><w:r><w:rPr><w:rFonts w:ascii="DB ChuanPim PSU Light" w:hAnsi="DB ChuanPim PSU Light" w:cs="DB ChuanPim PSU Light"/></w:rPr><w:t xml:space="preserve">     </w:t></w:r><w:r><w:rPr><w:rFonts w:ascii="DB ChuanPim PSU Light" w:hAnsi="DB ChuanPim PSU Light" w:cs="DB ChuanPim PSU Light"/></w:rPr><w:tab/></w:r><w:r><w:rPr><w:rFonts w:ascii="DB ChuanPim PSU Light" w:hAnsi="DB ChuanPim PSU Light" w:cs="DB ChuanPim PSU Light"/></w:rPr><w:tab/></w:r><w:r><w:rPr><w:rFonts w:ascii="DB ChuanPim PSU Light" w:hAnsi="DB ChuanPim PSU Light" w:cs="DB ChuanPim PSU Light"/></w:rPr><w:tab/></w:r><w:r><w:rPr><w:rFonts w:ascii="DB ChuanPim PSU Light" w:hAnsi="DB ChuanPim PSU Light" w:cs="DB ChuanPim PSU Light"/></w:rPr><w:tab/></w:r><w:r><w:rPr><w:rFonts w:ascii="DB ChuanPim PSU Light" w:hAnsi="DB ChuanPim PSU Light" w:cs="DB ChuanPim PSU Light"/></w:rPr><w:tab/><w:t xml:space="preserve">      ……..……/……..……/…………..</w:t></w:r></w:p><w:p><w:pPr><w:ind w:left="3600" w:firstLine="720"/><w:rPr><w:rFonts w:ascii="TH SarabunPSK" w:hAnsi="TH SarabunPSK" w:cs="TH SarabunPSK"/><w:sz w:val="30"/><w:szCs w:val="30"/></w:rPr></w:pPr><w:r><w:rPr><w:rFonts w:ascii="TH SarabunPSK" w:hAnsi="TH SarabunPSK" w:cs="TH SarabunPSK"/><w:sz w:val="30"/><w:szCs w:val="30"/><w:cs/></w:rPr><w:tab/></w:r></w:p><w:p><w:pPr><w:jc w:val="center"/><w:rPr><w:rFonts w:ascii="DB ChuanPim PSU Light" w:hAnsi="DB ChuanPim PSU Light" w:cs="DB ChuanPim PSU Light"/><w:b/><w:bCs/><w:cs/></w:rPr></w:pPr><w:r><w:rPr><w:rFonts w:ascii="TH SarabunPSK" w:hAnsi="TH SarabunPSK" w:cs="TH SarabunPSK"/><w:sz w:val="30"/><w:szCs w:val="30"/><w:cs/></w:rPr><w:tab/></w:r><w:r><w:rPr><w:rFonts w:ascii="TH SarabunPSK" w:hAnsi="TH SarabunPSK" w:cs="TH SarabunPSK"/><w:sz w:val="30"/><w:szCs w:val="30"/><w:cs/></w:rPr><w:tab/></w:r><w:r><w:rPr><w:rFonts w:ascii="TH SarabunPSK" w:hAnsi="TH SarabunPSK" w:cs="TH SarabunPSK"/><w:sz w:val="30"/><w:szCs w:val="30"/><w:cs/></w:rPr><w:tab/></w:r><w:r><w:rPr><w:rFonts w:ascii="TH SarabunPSK" w:hAnsi="TH SarabunPSK" w:cs="TH SarabunPSK"/><w:sz w:val="30"/><w:szCs w:val="30"/><w:cs/></w:rPr><w:tab/></w:r><w:r><w:rPr><w:rFonts w:ascii="TH SarabunPSK" w:hAnsi="TH SarabunPSK" w:cs="TH SarabunPSK"/><w:sz w:val="30"/><w:szCs w:val="30"/><w:cs/></w:rPr><w:tab/></w:r><w:r><w:rPr><w:rFonts w:ascii="TH SarabunPSK" w:hAnsi="TH SarabunPSK" w:cs="TH SarabunPSK"/><w:sz w:val="30"/><w:szCs w:val="30"/><w:cs/></w:rPr><w:tab/></w:r><w:r><w:rPr><w:rFonts w:ascii="TH SarabunPSK" w:hAnsi="TH SarabunPSK" w:cs="TH SarabunPSK" w:hint="cs"/><w:sz w:val="30"/><w:szCs w:val="30"/><w:cs/></w:rPr><w:t xml:space="preserve">        </w:t></w:r></w:p><w:sectPr><w:headerReference w:type="default" r:id="rId9"/><w:pgSz w:w="11906" w:h="16838"/><w:pgMar w:top="851" w:right="1134" w:bottom="851" w:left="1701" w:header="709" w:footer="709" w:gutter="0"/><w:pgNumType w:fmt="thaiLetters"/><w:cols w:space="708"/><w:docGrid w:linePitch="381"/></w:sectPr></w:body></w:document>
 </file>
 
 <file path=word/endnotes.xml><?xml version="1.0" encoding="utf-8"?>

</xml_diff>